<commit_message>
First draft for the final project report and modified FirstPart.sql file
</commit_message>
<xml_diff>
--- a/SOEN363_Project_Phase1_TeamName.docx
+++ b/SOEN363_Project_Phase1_TeamName.docx
@@ -173,7 +173,6 @@
             <w:dataBinding w:prefixMappings="xmlns:ns0='http://purl.org/dc/elements/1.1/' xmlns:ns1='http://schemas.openxmlformats.org/package/2006/metadata/core-properties' " w:xpath="/ns1:coreProperties[1]/ns0:subject[1]" w:storeItemID="{6C3C8BC8-F283-45AE-878A-BAB7291924A1}"/>
             <w:text/>
           </w:sdtPr>
-          <w:sdtEndPr/>
           <w:sdtContent>
             <w:p>
               <w:pPr>
@@ -288,7 +287,6 @@
                                     <w:calendar w:val="gregorian"/>
                                   </w:date>
                                 </w:sdtPr>
-                                <w:sdtEndPr/>
                                 <w:sdtContent>
                                   <w:p>
                                     <w:pPr>
@@ -334,7 +332,6 @@
                                     <w:dataBinding w:prefixMappings="xmlns:ns0='http://schemas.openxmlformats.org/officeDocument/2006/extended-properties' " w:xpath="/ns0:Properties[1]/ns0:Company[1]" w:storeItemID="{6668398D-A668-4E3E-A5EB-62B293D839F1}"/>
                                     <w:text/>
                                   </w:sdtPr>
-                                  <w:sdtEndPr/>
                                   <w:sdtContent>
                                     <w:r>
                                       <w:rPr>
@@ -365,7 +362,6 @@
                                     <w:dataBinding w:prefixMappings="xmlns:ns0='http://schemas.microsoft.com/office/2006/coverPageProps' " w:xpath="/ns0:CoverPageProperties[1]/ns0:CompanyAddress[1]" w:storeItemID="{55AF091B-3C7A-41E3-B477-F2FDAA23CFDA}"/>
                                     <w:text/>
                                   </w:sdtPr>
-                                  <w:sdtEndPr/>
                                   <w:sdtContent>
                                     <w:r>
                                       <w:rPr>
@@ -1582,10 +1578,7 @@
     </w:p>
     <w:p>
       <w:r>
-        <w:t xml:space="preserve">This project involves designing and implementing a Hospital Management System (HMS) database. The work includes creating an ER model, implementing the schema in PostgreSQL, and using AI to generate </w:t>
-      </w:r>
-      <w:r>
-        <w:t>realistic sample data. Deliverables include the ER diagram, relational schema, SQL DDL, populated dataset, and 20 required queries, each with a brief explanation of its purpose.</w:t>
+        <w:t>This project involves designing and implementing a Hospital Management System (HMS) database. The work includes creating an ER model, implementing the schema in PostgreSQL, and using AI to generate realistic sample data. Deliverables include the ER diagram, relational schema, SQL DDL, populated dataset, and 20 required queries, each with a brief explanation of its purpose.</w:t>
       </w:r>
     </w:p>
     <w:p>
@@ -1791,14 +1784,1316 @@
     </w:p>
     <w:p>
       <w:r>
+        <w:object w:dxaOrig="1543" w:dyaOrig="1000" w14:anchorId="7166AACA">
+          <v:shapetype id="_x0000_t75" coordsize="21600,21600" o:spt="75" o:preferrelative="t" path="m@4@5l@4@11@9@11@9@5xe" filled="f" stroked="f">
+            <v:stroke joinstyle="miter"/>
+            <v:formulas>
+              <v:f eqn="if lineDrawn pixelLineWidth 0"/>
+              <v:f eqn="sum @0 1 0"/>
+              <v:f eqn="sum 0 0 @1"/>
+              <v:f eqn="prod @2 1 2"/>
+              <v:f eqn="prod @3 21600 pixelWidth"/>
+              <v:f eqn="prod @3 21600 pixelHeight"/>
+              <v:f eqn="sum @0 0 1"/>
+              <v:f eqn="prod @6 1 2"/>
+              <v:f eqn="prod @7 21600 pixelWidth"/>
+              <v:f eqn="sum @8 21600 0"/>
+              <v:f eqn="prod @7 21600 pixelHeight"/>
+              <v:f eqn="sum @10 21600 0"/>
+            </v:formulas>
+            <v:path o:extrusionok="f" gradientshapeok="t" o:connecttype="rect"/>
+            <o:lock v:ext="edit" aspectratio="t"/>
+          </v:shapetype>
+          <v:shape id="_x0000_i1025" type="#_x0000_t75" style="width:77.15pt;height:50pt" o:ole="">
+            <v:imagedata r:id="rId11" o:title=""/>
+          </v:shape>
+          <o:OLEObject Type="Embed" ProgID="Acrobat.Document.DC" ShapeID="_x0000_i1025" DrawAspect="Icon" ObjectID="_1852969455" r:id="rId12"/>
+        </w:object>
+      </w:r>
+    </w:p>
+    <w:p>
+      <w:r>
+        <w:t xml:space="preserve">Entities: </w:t>
+      </w:r>
+      <w:r>
+        <w:rPr>
+          <w:i/>
+        </w:rPr>
+        <w:t>icd9_dict</w:t>
+      </w:r>
+      <w:r>
+        <w:t xml:space="preserve">, </w:t>
+      </w:r>
+      <w:r>
+        <w:rPr>
+          <w:i/>
+        </w:rPr>
+        <w:t>physician</w:t>
+      </w:r>
+      <w:r>
+        <w:t xml:space="preserve">, </w:t>
+      </w:r>
+      <w:r>
+        <w:rPr>
+          <w:i/>
+        </w:rPr>
+        <w:t>nurse</w:t>
+      </w:r>
+      <w:r>
+        <w:t xml:space="preserve">, </w:t>
+      </w:r>
+      <w:r>
+        <w:rPr>
+          <w:i/>
+        </w:rPr>
+        <w:t>patient</w:t>
+      </w:r>
+      <w:r>
+        <w:t xml:space="preserve">, </w:t>
+      </w:r>
+      <w:r>
+        <w:rPr>
+          <w:i/>
+        </w:rPr>
+        <w:t>admission</w:t>
+      </w:r>
+      <w:r>
+        <w:t xml:space="preserve">, </w:t>
+      </w:r>
+      <w:r>
+        <w:rPr>
+          <w:i/>
+        </w:rPr>
+        <w:t>triage</w:t>
+      </w:r>
+      <w:r>
+        <w:rPr>
+          <w:i/>
+        </w:rPr>
+        <w:t>_</w:t>
+      </w:r>
+      <w:r>
+        <w:rPr>
+          <w:i/>
+        </w:rPr>
+        <w:t>assessment</w:t>
+      </w:r>
+      <w:r>
+        <w:t xml:space="preserve">, </w:t>
+      </w:r>
+      <w:r>
+        <w:rPr>
+          <w:i/>
+        </w:rPr>
+        <w:t>diagnosis</w:t>
+      </w:r>
+      <w:r>
+        <w:t xml:space="preserve">, </w:t>
+      </w:r>
+      <w:r>
+        <w:rPr>
+          <w:i/>
+        </w:rPr>
+        <w:t>icu_stay</w:t>
+      </w:r>
+      <w:r>
+        <w:t xml:space="preserve">, </w:t>
+      </w:r>
+      <w:r>
+        <w:rPr>
+          <w:i/>
+        </w:rPr>
+        <w:t>clinical note</w:t>
+      </w:r>
+      <w:r>
+        <w:t xml:space="preserve">, </w:t>
+      </w:r>
+      <w:r>
+        <w:rPr>
+          <w:i/>
+        </w:rPr>
+        <w:t>diagnostic order</w:t>
+      </w:r>
+      <w:r>
+        <w:t xml:space="preserve">, </w:t>
+      </w:r>
+      <w:r>
+        <w:rPr>
+          <w:i/>
+        </w:rPr>
+        <w:t>radiology_examination</w:t>
+      </w:r>
+      <w:r>
+        <w:t xml:space="preserve">, </w:t>
+      </w:r>
+      <w:r>
+        <w:rPr>
+          <w:i/>
+        </w:rPr>
+        <w:t>radiology_report</w:t>
+      </w:r>
+      <w:r>
+        <w:t xml:space="preserve">, </w:t>
+      </w:r>
+      <w:r>
+        <w:rPr>
+          <w:i/>
+        </w:rPr>
+        <w:t>discharge record</w:t>
+      </w:r>
+      <w:r>
+        <w:t xml:space="preserve">, and </w:t>
+      </w:r>
+      <w:r>
+        <w:rPr>
+          <w:i/>
+        </w:rPr>
+        <w:t>surgical procedure</w:t>
+      </w:r>
+      <w:r>
+        <w:t>.</w:t>
+      </w:r>
+    </w:p>
+    <w:p>
+      <w:r>
+        <w:t>Key relationships:</w:t>
+      </w:r>
+    </w:p>
+    <w:p>
+      <w:pPr>
+        <w:pStyle w:val="ListParagraph"/>
+        <w:numPr>
+          <w:ilvl w:val="0"/>
+          <w:numId w:val="8"/>
+        </w:numPr>
+      </w:pPr>
+      <w:r>
+        <w:t>One patient may have many admissions.</w:t>
+      </w:r>
+    </w:p>
+    <w:p>
+      <w:pPr>
+        <w:pStyle w:val="ListParagraph"/>
+        <w:numPr>
+          <w:ilvl w:val="0"/>
+          <w:numId w:val="8"/>
+        </w:numPr>
+      </w:pPr>
+      <w:r>
+        <w:t>Each admission has one triage assessment.</w:t>
+      </w:r>
+    </w:p>
+    <w:p>
+      <w:pPr>
+        <w:pStyle w:val="ListParagraph"/>
+        <w:numPr>
+          <w:ilvl w:val="0"/>
+          <w:numId w:val="8"/>
+        </w:numPr>
+      </w:pPr>
+      <w:r>
+        <w:t>Each admission may have multiple diagnoses, including one required primary diagnosis.</w:t>
+      </w:r>
+    </w:p>
+    <w:p>
+      <w:pPr>
+        <w:pStyle w:val="ListParagraph"/>
+        <w:numPr>
+          <w:ilvl w:val="0"/>
+          <w:numId w:val="8"/>
+        </w:numPr>
+      </w:pPr>
+      <w:r>
+        <w:t>Admission</w:t>
+      </w:r>
+      <w:r>
+        <w:t xml:space="preserve"> may have at most one ICU stay.</w:t>
+      </w:r>
+    </w:p>
+    <w:p>
+      <w:pPr>
+        <w:pStyle w:val="ListParagraph"/>
+        <w:numPr>
+          <w:ilvl w:val="0"/>
+          <w:numId w:val="8"/>
+        </w:numPr>
+      </w:pPr>
+      <w:r>
+        <w:t>Each admission may include multiple clinical notes.</w:t>
+      </w:r>
+    </w:p>
+    <w:p>
+      <w:pPr>
+        <w:pStyle w:val="ListParagraph"/>
+        <w:numPr>
+          <w:ilvl w:val="0"/>
+          <w:numId w:val="8"/>
+        </w:numPr>
+      </w:pPr>
+      <w:r>
+        <w:t>Each admission may have multiple diagnostic orders; each order links to one radiology examination, and each examination links to one radiology report.</w:t>
+      </w:r>
+    </w:p>
+    <w:p>
+      <w:pPr>
+        <w:pStyle w:val="ListParagraph"/>
+        <w:numPr>
+          <w:ilvl w:val="0"/>
+          <w:numId w:val="8"/>
+        </w:numPr>
+      </w:pPr>
+      <w:r>
+        <w:t>Each admission may have one discharge record.</w:t>
+      </w:r>
+    </w:p>
+    <w:p>
+      <w:pPr>
+        <w:pStyle w:val="ListParagraph"/>
+        <w:numPr>
+          <w:ilvl w:val="0"/>
+          <w:numId w:val="8"/>
+        </w:numPr>
+      </w:pPr>
+      <w:r>
+        <w:t>Each admission may include multiple surgical procedures.</w:t>
+      </w:r>
+    </w:p>
+    <w:p>
+      <w:r>
+        <w:t>The diagram identifies all cardinality and participation constraints</w:t>
+      </w:r>
+    </w:p>
+    <w:p>
+      <w:pPr>
+        <w:pStyle w:val="Heading1"/>
+        <w:rPr>
+          <w:rFonts w:cstheme="minorBidi"/>
+        </w:rPr>
+      </w:pPr>
+      <w:bookmarkStart w:id="4" w:name="_Toc242304775"/>
+      <w:r>
+        <w:rPr>
+          <w:rFonts w:cstheme="minorBidi"/>
+        </w:rPr>
+        <w:t>Relational Schema</w:t>
+      </w:r>
+      <w:bookmarkEnd w:id="4"/>
+    </w:p>
+    <w:p>
+      <w:r>
+        <w:t xml:space="preserve">All tables </w:t>
+      </w:r>
+      <w:r>
+        <w:t>satisfy</w:t>
+      </w:r>
+      <w:r>
+        <w:t xml:space="preserve"> third normal form (3NF), </w:t>
+      </w:r>
+      <w:r>
+        <w:t>eliminating</w:t>
+      </w:r>
+      <w:r>
+        <w:t xml:space="preserve"> partial </w:t>
+      </w:r>
+      <w:r>
+        <w:t>and</w:t>
+      </w:r>
+      <w:r>
+        <w:t xml:space="preserve"> transitive dependencies</w:t>
+      </w:r>
+    </w:p>
+    <w:p>
+      <w:pPr>
+        <w:rPr>
+          <w:rFonts w:asciiTheme="majorHAnsi" w:eastAsiaTheme="majorEastAsia" w:hAnsiTheme="majorHAnsi"/>
+          <w:color w:val="0F4761" w:themeColor="accent1" w:themeShade="BF"/>
+          <w:sz w:val="40"/>
+          <w:szCs w:val="40"/>
+        </w:rPr>
+      </w:pPr>
+      <w:bookmarkStart w:id="5" w:name="_Toc242304776"/>
+      <w:r>
+        <w:br w:type="page"/>
+      </w:r>
+    </w:p>
+    <w:p>
+      <w:pPr>
+        <w:pStyle w:val="Heading1"/>
+        <w:rPr>
+          <w:rFonts w:cstheme="minorBidi"/>
+        </w:rPr>
+      </w:pPr>
+      <w:r>
+        <w:rPr>
+          <w:rFonts w:cstheme="minorBidi"/>
+        </w:rPr>
+        <w:lastRenderedPageBreak/>
+        <w:t>Data Population</w:t>
+      </w:r>
+      <w:bookmarkEnd w:id="5"/>
+    </w:p>
+    <w:p>
+      <w:r>
+        <w:t xml:space="preserve">The </w:t>
+      </w:r>
+      <w:r>
+        <w:rPr>
+          <w:i/>
+        </w:rPr>
+        <w:t>generate_data.py</w:t>
+      </w:r>
+      <w:r>
+        <w:t xml:space="preserve"> script creates </w:t>
+      </w:r>
+      <w:r>
+        <w:rPr>
+          <w:i/>
+        </w:rPr>
+        <w:t>populate_all_hospital.sql</w:t>
+      </w:r>
+      <w:r>
+        <w:t>, which contains the sample-data INSERT statements.</w:t>
+      </w:r>
+    </w:p>
+    <w:p>
+      <w:r>
+        <w:t>The generated dataset includes:</w:t>
+      </w:r>
+    </w:p>
+    <w:p>
+      <w:pPr>
+        <w:pStyle w:val="ListParagraph"/>
+        <w:numPr>
+          <w:ilvl w:val="0"/>
+          <w:numId w:val="9"/>
+        </w:numPr>
+      </w:pPr>
+      <w:r>
+        <w:t>4 ICD-9 codes, 15 physicians, 10 nurses, and 40 patients.</w:t>
+      </w:r>
+    </w:p>
+    <w:p>
+      <w:pPr>
+        <w:pStyle w:val="ListParagraph"/>
+        <w:numPr>
+          <w:ilvl w:val="0"/>
+          <w:numId w:val="9"/>
+        </w:numPr>
+      </w:pPr>
+      <w:r>
+        <w:t xml:space="preserve">50 admissions, 50 triage assessments, </w:t>
+      </w:r>
+      <w:r>
+        <w:t>about</w:t>
+      </w:r>
+      <w:r>
+        <w:t xml:space="preserve"> 75 diagnoses, </w:t>
+      </w:r>
+      <w:r>
+        <w:t>about</w:t>
+      </w:r>
+      <w:r>
+        <w:t xml:space="preserve"> 25 ICU stays, and 50 clinical notes.</w:t>
+      </w:r>
+    </w:p>
+    <w:p>
+      <w:pPr>
+        <w:pStyle w:val="ListParagraph"/>
+        <w:numPr>
+          <w:ilvl w:val="0"/>
+          <w:numId w:val="9"/>
+        </w:numPr>
+      </w:pPr>
+      <w:r>
+        <w:t>About 25 diagnostic orders, radiology examinations, and radiology reports.</w:t>
+      </w:r>
+    </w:p>
+    <w:p>
+      <w:pPr>
+        <w:pStyle w:val="ListParagraph"/>
+        <w:numPr>
+          <w:ilvl w:val="0"/>
+          <w:numId w:val="9"/>
+        </w:numPr>
+      </w:pPr>
+      <w:r>
+        <w:t xml:space="preserve">50 discharge records and </w:t>
+      </w:r>
+      <w:r>
+        <w:t>about</w:t>
+      </w:r>
+      <w:r>
+        <w:t xml:space="preserve"> 15–20 surgical procedures.</w:t>
+      </w:r>
+    </w:p>
+    <w:p>
+      <w:pPr>
+        <w:pStyle w:val="ListParagraph"/>
+        <w:numPr>
+          <w:ilvl w:val="0"/>
+          <w:numId w:val="9"/>
+        </w:numPr>
+      </w:pPr>
+      <w:r>
+        <w:t>The generator applies these realism safeguards:</w:t>
+      </w:r>
+    </w:p>
+    <w:p>
+      <w:pPr>
+        <w:pStyle w:val="ListParagraph"/>
+        <w:numPr>
+          <w:ilvl w:val="0"/>
+          <w:numId w:val="9"/>
+        </w:numPr>
+      </w:pPr>
+      <w:r>
+        <w:t>All timestamps are historical.</w:t>
+      </w:r>
+    </w:p>
+    <w:p>
+      <w:pPr>
+        <w:pStyle w:val="ListParagraph"/>
+        <w:numPr>
+          <w:ilvl w:val="0"/>
+          <w:numId w:val="9"/>
+        </w:numPr>
+      </w:pPr>
+      <w:r>
+        <w:t xml:space="preserve">ICU exit times </w:t>
+      </w:r>
+      <w:r>
+        <w:t>never occur after</w:t>
+      </w:r>
+      <w:r>
+        <w:t xml:space="preserve"> discharge.</w:t>
+      </w:r>
+    </w:p>
+    <w:p>
+      <w:pPr>
+        <w:pStyle w:val="ListParagraph"/>
+        <w:numPr>
+          <w:ilvl w:val="0"/>
+          <w:numId w:val="9"/>
+        </w:numPr>
+      </w:pPr>
+      <w:r>
+        <w:t xml:space="preserve">Patients who die during a stay </w:t>
+      </w:r>
+      <w:r>
+        <w:t xml:space="preserve">are assigned </w:t>
+      </w:r>
+      <w:r>
+        <w:rPr>
+          <w:i/>
+        </w:rPr>
+        <w:t>life_status = 'Deceased'</w:t>
+      </w:r>
+      <w:r>
+        <w:t xml:space="preserve"> and </w:t>
+      </w:r>
+      <w:r>
+        <w:t xml:space="preserve">have </w:t>
+      </w:r>
+      <w:r>
+        <w:t>a corresponding discharge record.</w:t>
+      </w:r>
+    </w:p>
+    <w:p>
+      <w:r>
+        <w:t xml:space="preserve">For reproducibility, </w:t>
+      </w:r>
+      <w:r>
+        <w:rPr>
+          <w:i/>
+        </w:rPr>
+        <w:t>random. seed</w:t>
+      </w:r>
+      <w:r>
+        <w:rPr>
+          <w:i/>
+        </w:rPr>
+        <w:t>(42</w:t>
+      </w:r>
+      <w:r>
+        <w:rPr>
+          <w:i/>
+          <w:iCs/>
+        </w:rPr>
+        <w:t>)</w:t>
+      </w:r>
+      <w:r>
+        <w:t xml:space="preserve"> produces the same dataset on every run.</w:t>
+      </w:r>
+    </w:p>
+    <w:p>
+      <w:pPr>
+        <w:rPr>
+          <w:rFonts w:asciiTheme="majorHAnsi" w:eastAsiaTheme="majorEastAsia" w:hAnsiTheme="majorHAnsi"/>
+          <w:color w:val="0F4761" w:themeColor="accent1" w:themeShade="BF"/>
+          <w:sz w:val="40"/>
+          <w:szCs w:val="40"/>
+        </w:rPr>
+      </w:pPr>
+      <w:bookmarkStart w:id="6" w:name="_Toc242304777"/>
+      <w:r>
+        <w:br w:type="page"/>
+      </w:r>
+    </w:p>
+    <w:p>
+      <w:pPr>
+        <w:pStyle w:val="Heading1"/>
+        <w:rPr>
+          <w:rFonts w:cstheme="minorBidi"/>
+        </w:rPr>
+      </w:pPr>
+      <w:r>
+        <w:rPr>
+          <w:rFonts w:cstheme="minorBidi"/>
+        </w:rPr>
+        <w:lastRenderedPageBreak/>
+        <w:t>Queries (Q1</w:t>
+      </w:r>
+      <w:r>
+        <w:rPr>
+          <w:rFonts w:cstheme="minorBidi"/>
+        </w:rPr>
+        <w:t>–</w:t>
+      </w:r>
+      <w:r>
+        <w:rPr>
+          <w:rFonts w:cstheme="minorBidi"/>
+        </w:rPr>
+        <w:t>Q20)</w:t>
+      </w:r>
+      <w:bookmarkEnd w:id="6"/>
+    </w:p>
+    <w:p>
+      <w:r>
+        <w:t>Each team member must complete four or five queries, as required by the handout.</w:t>
+      </w:r>
+    </w:p>
+    <w:p>
+      <w:r>
+        <w:t>Query assignments:</w:t>
+      </w:r>
+    </w:p>
+    <w:p>
+      <w:pPr>
+        <w:pStyle w:val="ListParagraph"/>
+        <w:numPr>
+          <w:ilvl w:val="0"/>
+          <w:numId w:val="16"/>
+        </w:numPr>
+        <w:rPr>
+          <w:lang w:val="fr-FR"/>
+        </w:rPr>
+      </w:pPr>
+      <w:r>
+        <w:rPr>
+          <w:lang w:val="fr-FR"/>
+        </w:rPr>
+        <w:t>@Zitkq — Q1–Q4</w:t>
+      </w:r>
+    </w:p>
+    <w:p>
+      <w:pPr>
+        <w:pStyle w:val="ListParagraph"/>
+        <w:numPr>
+          <w:ilvl w:val="0"/>
+          <w:numId w:val="16"/>
+        </w:numPr>
+        <w:rPr>
+          <w:lang w:val="fr-FR"/>
+        </w:rPr>
+      </w:pPr>
+      <w:r>
+        <w:rPr>
+          <w:lang w:val="fr-FR"/>
+        </w:rPr>
+        <w:t>@JuanMa_487 — Q5–Q8</w:t>
+      </w:r>
+    </w:p>
+    <w:p>
+      <w:pPr>
+        <w:pStyle w:val="ListParagraph"/>
+        <w:numPr>
+          <w:ilvl w:val="0"/>
+          <w:numId w:val="16"/>
+        </w:numPr>
+        <w:rPr>
+          <w:lang w:val="fr-FR"/>
+        </w:rPr>
+      </w:pPr>
+      <w:r>
+        <w:rPr>
+          <w:lang w:val="fr-FR"/>
+        </w:rPr>
+        <w:t>@Mohammad — Q9–Q12</w:t>
+      </w:r>
+    </w:p>
+    <w:p>
+      <w:pPr>
+        <w:pStyle w:val="ListParagraph"/>
+        <w:numPr>
+          <w:ilvl w:val="0"/>
+          <w:numId w:val="16"/>
+        </w:numPr>
+        <w:rPr>
+          <w:lang w:val="fr-FR"/>
+        </w:rPr>
+      </w:pPr>
+      <w:r>
+        <w:rPr>
+          <w:lang w:val="fr-FR"/>
+        </w:rPr>
+        <w:t>@Laurent — Q13–Q16</w:t>
+      </w:r>
+    </w:p>
+    <w:p>
+      <w:pPr>
+        <w:pStyle w:val="ListParagraph"/>
+        <w:numPr>
+          <w:ilvl w:val="0"/>
+          <w:numId w:val="16"/>
+        </w:numPr>
+      </w:pPr>
+      <w:r>
+        <w:t>@fmvemba — Q17–Q20</w:t>
+      </w:r>
+    </w:p>
+    <w:p>
+      <w:r>
+        <w:t xml:space="preserve">For </w:t>
+      </w:r>
+      <w:r>
+        <w:t>every</w:t>
+      </w:r>
+      <w:r>
+        <w:t xml:space="preserve"> query, </w:t>
+      </w:r>
+      <w:r>
+        <w:t>provide</w:t>
+      </w:r>
+      <w:r>
+        <w:t>:</w:t>
+      </w:r>
+    </w:p>
+    <w:p>
+      <w:pPr>
+        <w:pStyle w:val="ListParagraph"/>
+        <w:numPr>
+          <w:ilvl w:val="0"/>
+          <w:numId w:val="13"/>
+        </w:numPr>
+      </w:pPr>
+      <w:r>
+        <w:t>The complete SQL statement.</w:t>
+      </w:r>
+    </w:p>
+    <w:p>
+      <w:pPr>
+        <w:pStyle w:val="ListParagraph"/>
+        <w:numPr>
+          <w:ilvl w:val="0"/>
+          <w:numId w:val="13"/>
+        </w:numPr>
+      </w:pPr>
+      <w:r>
+        <w:t xml:space="preserve">A </w:t>
+      </w:r>
+      <w:r>
+        <w:t xml:space="preserve">pgAdmin </w:t>
+      </w:r>
+      <w:r>
+        <w:t xml:space="preserve">screenshot </w:t>
+      </w:r>
+      <w:r>
+        <w:t>showing</w:t>
+      </w:r>
+      <w:r>
+        <w:t xml:space="preserve"> the result.</w:t>
+      </w:r>
+    </w:p>
+    <w:p>
+      <w:pPr>
+        <w:pStyle w:val="ListParagraph"/>
+        <w:numPr>
+          <w:ilvl w:val="0"/>
+          <w:numId w:val="13"/>
+        </w:numPr>
+      </w:pPr>
+      <w:r>
+        <w:t xml:space="preserve">A </w:t>
+      </w:r>
+      <w:r>
+        <w:t>concise</w:t>
+      </w:r>
+      <w:r>
+        <w:t xml:space="preserve"> explanation of the </w:t>
+      </w:r>
+      <w:r>
+        <w:t>query’s</w:t>
+      </w:r>
+      <w:r>
+        <w:t xml:space="preserve"> logic and </w:t>
+      </w:r>
+      <w:r>
+        <w:t>output</w:t>
+      </w:r>
+    </w:p>
+    <w:p>
+      <w:pPr>
+        <w:rPr>
+          <w:rFonts w:asciiTheme="majorHAnsi" w:eastAsiaTheme="majorEastAsia" w:hAnsiTheme="majorHAnsi" w:cstheme="majorBidi"/>
+          <w:color w:val="0F4761" w:themeColor="accent1" w:themeShade="BF"/>
+          <w:sz w:val="40"/>
+          <w:szCs w:val="40"/>
+        </w:rPr>
+      </w:pPr>
+      <w:bookmarkStart w:id="7" w:name="_Toc242304778"/>
+      <w:r>
+        <w:br w:type="page"/>
+      </w:r>
+    </w:p>
+    <w:p>
+      <w:pPr>
+        <w:pStyle w:val="Heading1"/>
+      </w:pPr>
+      <w:r>
+        <w:lastRenderedPageBreak/>
+        <w:t>Submitted</w:t>
+      </w:r>
+      <w:r>
+        <w:t xml:space="preserve"> Files</w:t>
+      </w:r>
+      <w:bookmarkEnd w:id="7"/>
+    </w:p>
+    <w:p>
+      <w:r>
+        <w:t>| File | Purpose |</w:t>
+      </w:r>
+    </w:p>
+    <w:p>
+      <w:r>
+        <w:t xml:space="preserve">| </w:t>
+      </w:r>
+      <w:r>
+        <w:rPr>
+          <w:i/>
+        </w:rPr>
+        <w:t>TablesCreation.sql</w:t>
+      </w:r>
+      <w:r>
+        <w:t xml:space="preserve"> | </w:t>
+      </w:r>
+      <w:r>
+        <w:t>Creates</w:t>
+      </w:r>
+      <w:r>
+        <w:t xml:space="preserve"> all 14 tables and </w:t>
+      </w:r>
+      <w:r>
+        <w:t xml:space="preserve">defines </w:t>
+      </w:r>
+      <w:r>
+        <w:t>their constraints. |</w:t>
+      </w:r>
+    </w:p>
+    <w:p>
+      <w:r>
+        <w:t xml:space="preserve">| </w:t>
+      </w:r>
+      <w:r>
+        <w:rPr>
+          <w:i/>
+        </w:rPr>
+        <w:t>generate_data.py</w:t>
+      </w:r>
+      <w:r>
+        <w:t xml:space="preserve"> | </w:t>
+      </w:r>
+      <w:r>
+        <w:t>Generates</w:t>
+      </w:r>
+      <w:r>
+        <w:t xml:space="preserve"> the </w:t>
+      </w:r>
+      <w:r>
+        <w:t xml:space="preserve">database </w:t>
+      </w:r>
+      <w:r>
+        <w:t>INSERT statements. |</w:t>
+      </w:r>
+    </w:p>
+    <w:p>
+      <w:r>
+        <w:t xml:space="preserve">| </w:t>
+      </w:r>
+      <w:r>
+        <w:rPr>
+          <w:i/>
+        </w:rPr>
+        <w:t>populate_all_hospital.sql</w:t>
+      </w:r>
+      <w:r>
+        <w:t xml:space="preserve"> | </w:t>
+      </w:r>
+      <w:r>
+        <w:t>Populates</w:t>
+      </w:r>
+      <w:r>
+        <w:t xml:space="preserve"> the database</w:t>
+      </w:r>
+      <w:r>
+        <w:t xml:space="preserve"> with the complete sample dataset.</w:t>
+      </w:r>
+      <w:r>
+        <w:t xml:space="preserve"> |</w:t>
+      </w:r>
+    </w:p>
+    <w:p>
+      <w:r>
+        <w:t xml:space="preserve">| </w:t>
+      </w:r>
+      <w:r>
+        <w:rPr>
+          <w:i/>
+        </w:rPr>
+        <w:t>FirstPart.sql</w:t>
+      </w:r>
+      <w:r>
+        <w:t xml:space="preserve"> | </w:t>
+      </w:r>
+      <w:r>
+        <w:t>Contains the final</w:t>
+      </w:r>
+      <w:r>
+        <w:t xml:space="preserve"> 20 SQL queries, Q1</w:t>
+      </w:r>
+      <w:r>
+        <w:t>–</w:t>
+      </w:r>
+      <w:r>
+        <w:t>Q20. |</w:t>
+      </w:r>
+    </w:p>
+    <w:p>
+      <w:r>
+        <w:t xml:space="preserve">| </w:t>
+      </w:r>
+      <w:r>
+        <w:rPr>
+          <w:i/>
+        </w:rPr>
+        <w:t>CheckTables.sql</w:t>
+      </w:r>
+      <w:r>
+        <w:t xml:space="preserve"> | </w:t>
+      </w:r>
+      <w:r>
+        <w:t>Verifies</w:t>
+      </w:r>
+      <w:r>
+        <w:t xml:space="preserve"> table contents</w:t>
+      </w:r>
+      <w:r>
+        <w:t xml:space="preserve"> and expected row counts.</w:t>
+      </w:r>
+      <w:r>
+        <w:t xml:space="preserve"> |</w:t>
+      </w:r>
+    </w:p>
+    <w:p>
+      <w:r>
+        <w:t>| ER diagram (</w:t>
+      </w:r>
+      <w:r>
+        <w:t>.drawio</w:t>
+      </w:r>
+      <w:r>
+        <w:t xml:space="preserve"> / </w:t>
+      </w:r>
+      <w:r>
+        <w:t>.png</w:t>
+      </w:r>
+      <w:r>
+        <w:t>) | Presents the entity-relationship model. |</w:t>
+      </w:r>
+    </w:p>
+    <w:p>
+      <w:r>
+        <w:t xml:space="preserve">| </w:t>
+      </w:r>
+      <w:r>
+        <w:rPr>
+          <w:i/>
+          <w:iCs/>
+        </w:rPr>
+        <w:t>README.md</w:t>
+      </w:r>
+      <w:r>
+        <w:t xml:space="preserve"> | Explains how to reproduce the database. |</w:t>
+      </w:r>
+    </w:p>
+    <w:p>
+      <w:pPr>
+        <w:pStyle w:val="Heading1"/>
+        <w:rPr>
+          <w:rFonts w:cstheme="minorBidi"/>
+        </w:rPr>
+      </w:pPr>
+      <w:bookmarkStart w:id="8" w:name="_Toc242304779"/>
+      <w:r>
+        <w:rPr>
+          <w:rFonts w:cstheme="minorBidi"/>
+        </w:rPr>
+        <w:t>Reproduction Steps</w:t>
+      </w:r>
+      <w:bookmarkEnd w:id="8"/>
+    </w:p>
+    <w:p>
+      <w:r>
+        <w:t xml:space="preserve">1. Create an empty PostgreSQL database named </w:t>
+      </w:r>
+      <w:r>
+        <w:rPr>
+          <w:i/>
+        </w:rPr>
+        <w:t>Superbase</w:t>
+      </w:r>
+      <w:r>
+        <w:rPr>
+          <w:i/>
+        </w:rPr>
+        <w:t xml:space="preserve"> HMS</w:t>
+      </w:r>
+      <w:r>
+        <w:t>.</w:t>
+      </w:r>
+    </w:p>
+    <w:p>
+      <w:r>
+        <w:t xml:space="preserve">2. Run </w:t>
+      </w:r>
+      <w:r>
+        <w:rPr>
+          <w:i/>
+        </w:rPr>
+        <w:t>TablesCreation.sql</w:t>
+      </w:r>
+      <w:r>
+        <w:t xml:space="preserve"> to </w:t>
+      </w:r>
+      <w:r>
+        <w:t>create</w:t>
+      </w:r>
+      <w:r>
+        <w:t xml:space="preserve"> the </w:t>
+      </w:r>
+      <w:r>
+        <w:t xml:space="preserve">database </w:t>
+      </w:r>
+      <w:r>
+        <w:t>schema.</w:t>
+      </w:r>
+    </w:p>
+    <w:p>
+      <w:r>
+        <w:t xml:space="preserve">3. Run </w:t>
+      </w:r>
+      <w:r>
+        <w:rPr>
+          <w:i/>
+        </w:rPr>
+        <w:t>populate_all_hospital.sql</w:t>
+      </w:r>
+      <w:r>
+        <w:t xml:space="preserve"> to </w:t>
+      </w:r>
+      <w:r>
+        <w:t>load</w:t>
+      </w:r>
+      <w:r>
+        <w:t xml:space="preserve"> the sample data.</w:t>
+      </w:r>
+    </w:p>
+    <w:p>
+      <w:r>
+        <w:t xml:space="preserve">4. Run </w:t>
+      </w:r>
+      <w:r>
+        <w:rPr>
+          <w:i/>
+        </w:rPr>
+        <w:t>CheckTables.sql</w:t>
+      </w:r>
+      <w:r>
+        <w:t xml:space="preserve"> </w:t>
+      </w:r>
+      <w:r>
+        <w:t>and verify</w:t>
+      </w:r>
+      <w:r>
+        <w:t xml:space="preserve"> the expected row counts.</w:t>
+      </w:r>
+    </w:p>
+    <w:p>
+      <w:r>
+        <w:t xml:space="preserve">5. Run Q1 through Q20 from </w:t>
+      </w:r>
+      <w:r>
+        <w:rPr>
+          <w:i/>
+          <w:iCs/>
+        </w:rPr>
+        <w:t>FirstPart.sql</w:t>
+      </w:r>
+      <w:r>
+        <w:t>.</w:t>
+      </w:r>
+    </w:p>
+    <w:p>
+      <w:pPr>
+        <w:pStyle w:val="Heading1"/>
+        <w:rPr>
+          <w:rFonts w:cstheme="minorBidi"/>
+        </w:rPr>
+      </w:pPr>
+      <w:bookmarkStart w:id="9" w:name="_Toc242304780"/>
+      <w:r>
+        <w:rPr>
+          <w:rFonts w:cstheme="minorBidi"/>
+        </w:rPr>
+        <w:t>Conclusion</w:t>
+      </w:r>
+      <w:bookmarkEnd w:id="9"/>
+    </w:p>
+    <w:p>
+      <w:r>
+        <w:t xml:space="preserve">The team </w:t>
+      </w:r>
+      <w:r>
+        <w:t>designed</w:t>
+      </w:r>
+      <w:r>
+        <w:t xml:space="preserve"> a normalized 14-table HMS database, populated it with realistic sample data, and </w:t>
+      </w:r>
+      <w:r>
+        <w:t>completed</w:t>
+      </w:r>
+      <w:r>
+        <w:t xml:space="preserve"> 20 SQL queries using </w:t>
+      </w:r>
+      <w:r>
+        <w:t>joints</w:t>
+      </w:r>
+      <w:r>
+        <w:t>, aggregates, subqueries, and CTEs.</w:t>
+      </w:r>
+    </w:p>
+    <w:p>
+      <w:r>
+        <w:t xml:space="preserve">The project </w:t>
+      </w:r>
+      <w:r>
+        <w:t>deepened</w:t>
+      </w:r>
+      <w:r>
+        <w:t xml:space="preserve"> the team’s understanding of schema</w:t>
+      </w:r>
+      <w:r>
+        <w:t xml:space="preserve"> </w:t>
+      </w:r>
+      <w:r>
+        <w:t>design, constraint enforcement, and reproducible data generation.</w:t>
+      </w:r>
+    </w:p>
+    <w:p/>
+    <w:p>
+      <w:pPr>
+        <w:rPr>
+          <w:rFonts w:asciiTheme="majorHAnsi" w:eastAsiaTheme="majorEastAsia" w:hAnsiTheme="majorHAnsi"/>
+          <w:color w:val="0F4761" w:themeColor="accent1" w:themeShade="BF"/>
+          <w:sz w:val="40"/>
+          <w:szCs w:val="40"/>
+        </w:rPr>
+      </w:pPr>
+      <w:r>
+        <w:br w:type="page"/>
+      </w:r>
+    </w:p>
+    <w:p>
+      <w:pPr>
+        <w:pStyle w:val="Heading1"/>
+        <w:rPr>
+          <w:rFonts w:cstheme="minorBidi"/>
+        </w:rPr>
+      </w:pPr>
+      <w:bookmarkStart w:id="10" w:name="_Toc242304781"/>
+      <w:r>
+        <w:rPr>
+          <w:rFonts w:cstheme="minorBidi"/>
+        </w:rPr>
+        <w:lastRenderedPageBreak/>
+        <w:t>Appendix A — Individual Query Screenshots</w:t>
+      </w:r>
+      <w:bookmarkEnd w:id="10"/>
+    </w:p>
+    <w:p/>
+    <w:p>
+      <w:r>
+        <w:t xml:space="preserve"> </w:t>
+      </w:r>
+      <w:r>
+        <w:rPr>
+          <w:b/>
+        </w:rPr>
+        <w:t>Q1</w:t>
+      </w:r>
+      <w:r>
+        <w:t xml:space="preserve"> — </w:t>
+      </w:r>
+      <w:r>
+        <w:rPr>
+          <w:i/>
+          <w:iCs/>
+        </w:rPr>
+        <w:t>[</w:t>
+      </w:r>
+      <w:r>
+        <w:rPr>
+          <w:i/>
+        </w:rPr>
+        <w:t>author</w:t>
+      </w:r>
+      <w:r>
+        <w:rPr>
+          <w:i/>
+          <w:iCs/>
+        </w:rPr>
+        <w:t>]</w:t>
+      </w:r>
+    </w:p>
+    <w:p>
+      <w:r>
+        <w:t xml:space="preserve">  </w:t>
+      </w:r>
+      <w:r>
+        <w:rPr>
+          <w:i/>
+          <w:iCs/>
+        </w:rPr>
+        <w:t xml:space="preserve">[insert </w:t>
+      </w:r>
+      <w:r>
+        <w:rPr>
+          <w:i/>
+        </w:rPr>
+        <w:t>screenshot</w:t>
+      </w:r>
+      <w:r>
+        <w:rPr>
+          <w:i/>
+          <w:iCs/>
+        </w:rPr>
+        <w:t>]</w:t>
+      </w:r>
+    </w:p>
+    <w:p>
+      <w:r>
+        <w:t xml:space="preserve">Explanation: </w:t>
+      </w:r>
+      <w:r>
+        <w:rPr>
+          <w:i/>
+          <w:iCs/>
+        </w:rPr>
+        <w:t>[</w:t>
+      </w:r>
+      <w:r>
+        <w:rPr>
+          <w:i/>
+          <w:iCs/>
+        </w:rPr>
+        <w:t>summarize</w:t>
+      </w:r>
+      <w:r>
+        <w:rPr>
+          <w:i/>
+          <w:iCs/>
+        </w:rPr>
+        <w:t xml:space="preserve"> the query logic and </w:t>
+      </w:r>
+      <w:r>
+        <w:rPr>
+          <w:i/>
+          <w:iCs/>
+        </w:rPr>
+        <w:t xml:space="preserve">key </w:t>
+      </w:r>
+      <w:r>
+        <w:rPr>
+          <w:i/>
+          <w:iCs/>
+        </w:rPr>
+        <w:t>result]</w:t>
+      </w:r>
+    </w:p>
+    <w:p>
+      <w:r>
+        <w:rPr>
+          <w:b/>
+          <w:bCs/>
+        </w:rPr>
+        <w:t>Q2</w:t>
+      </w:r>
+      <w:r>
+        <w:t xml:space="preserve"> — </w:t>
+      </w:r>
+      <w:r>
+        <w:rPr>
+          <w:i/>
+          <w:iCs/>
+        </w:rPr>
+        <w:t>[author]</w:t>
+      </w:r>
+    </w:p>
+    <w:p>
+      <w:r>
+        <w:t>Repeat this format for Q3 through Q</w:t>
+      </w:r>
+      <w:r>
+        <w:t>17</w:t>
+      </w:r>
+      <w:r>
+        <w:t>.</w:t>
+      </w:r>
+    </w:p>
+    <w:p/>
+    <w:p>
+      <w:r>
+        <w:t>Q17</w:t>
+      </w:r>
+      <w:r>
+        <w:t>- [</w:t>
+      </w:r>
+      <w:r>
+        <w:t>Freddy Mvemba</w:t>
+      </w:r>
+      <w:r>
+        <w:t>]</w:t>
+      </w:r>
+    </w:p>
+    <w:p>
+      <w:r>
         <w:rPr>
           <w:noProof/>
         </w:rPr>
         <w:drawing>
-          <wp:inline distT="0" distB="0" distL="0" distR="0" wp14:anchorId="4F48C5B6" wp14:editId="4EB0AA7C">
-            <wp:extent cx="5943600" cy="3706495"/>
-            <wp:effectExtent l="0" t="0" r="0" b="8255"/>
-            <wp:docPr id="1195615336" name="Picture 2"/>
+          <wp:inline distT="0" distB="0" distL="0" distR="0" wp14:anchorId="1F7E49F4" wp14:editId="51FC9156">
+            <wp:extent cx="3382332" cy="3480593"/>
+            <wp:effectExtent l="0" t="0" r="8890" b="5715"/>
+            <wp:docPr id="2018161121" name="Picture 1"/>
             <wp:cNvGraphicFramePr>
               <a:graphicFrameLocks xmlns:a="http://schemas.openxmlformats.org/drawingml/2006/main" noChangeAspect="1"/>
             </wp:cNvGraphicFramePr>
@@ -1806,17 +3101,81 @@
               <a:graphicData uri="http://schemas.openxmlformats.org/drawingml/2006/picture">
                 <pic:pic xmlns:pic="http://schemas.openxmlformats.org/drawingml/2006/picture">
                   <pic:nvPicPr>
-                    <pic:cNvPr id="1195615336" name="Picture 1195615336"/>
+                    <pic:cNvPr id="2018161121" name=""/>
+                    <pic:cNvPicPr/>
+                  </pic:nvPicPr>
+                  <pic:blipFill rotWithShape="1">
+                    <a:blip r:embed="rId13"/>
+                    <a:srcRect l="-495" r="5930"/>
+                    <a:stretch>
+                      <a:fillRect/>
+                    </a:stretch>
+                  </pic:blipFill>
+                  <pic:spPr bwMode="auto">
+                    <a:xfrm>
+                      <a:off x="0" y="0"/>
+                      <a:ext cx="3399847" cy="3498617"/>
+                    </a:xfrm>
+                    <a:prstGeom prst="rect">
+                      <a:avLst/>
+                    </a:prstGeom>
+                    <a:ln>
+                      <a:noFill/>
+                    </a:ln>
+                    <a:extLst>
+                      <a:ext uri="{53640926-AAD7-44D8-BBD7-CCE9431645EC}">
+                        <a14:shadowObscured xmlns:a14="http://schemas.microsoft.com/office/drawing/2010/main"/>
+                      </a:ext>
+                    </a:extLst>
+                  </pic:spPr>
+                </pic:pic>
+              </a:graphicData>
+            </a:graphic>
+          </wp:inline>
+        </w:drawing>
+      </w:r>
+    </w:p>
+    <w:p>
+      <w:r>
+        <w:t xml:space="preserve">Logic: </w:t>
+      </w:r>
+      <w:r>
+        <w:t>Group every admission's diagnoses together, count how many distinct ICD-9 codes appear, and keep only the admissions where that count exceeds 1.</w:t>
+      </w:r>
+    </w:p>
+    <w:p>
+      <w:r>
+        <w:br w:type="page"/>
+      </w:r>
+    </w:p>
+    <w:p>
+      <w:r>
+        <w:lastRenderedPageBreak/>
+        <w:t>Q18 – [Freddy Mvemba]</w:t>
+      </w:r>
+    </w:p>
+    <w:p>
+      <w:r>
+        <w:rPr>
+          <w:noProof/>
+        </w:rPr>
+        <w:drawing>
+          <wp:inline distT="0" distB="0" distL="0" distR="0" wp14:anchorId="0D403ED7" wp14:editId="22617234">
+            <wp:extent cx="5943600" cy="4824730"/>
+            <wp:effectExtent l="0" t="0" r="0" b="0"/>
+            <wp:docPr id="1051468563" name="Picture 1"/>
+            <wp:cNvGraphicFramePr>
+              <a:graphicFrameLocks xmlns:a="http://schemas.openxmlformats.org/drawingml/2006/main" noChangeAspect="1"/>
+            </wp:cNvGraphicFramePr>
+            <a:graphic xmlns:a="http://schemas.openxmlformats.org/drawingml/2006/main">
+              <a:graphicData uri="http://schemas.openxmlformats.org/drawingml/2006/picture">
+                <pic:pic xmlns:pic="http://schemas.openxmlformats.org/drawingml/2006/picture">
+                  <pic:nvPicPr>
+                    <pic:cNvPr id="1051468563" name=""/>
                     <pic:cNvPicPr/>
                   </pic:nvPicPr>
                   <pic:blipFill>
-                    <a:blip r:embed="rId11" cstate="print">
-                      <a:extLst>
-                        <a:ext uri="{28A0092B-C50C-407E-A947-70E740481C1C}">
-                          <a14:useLocalDpi xmlns:a14="http://schemas.microsoft.com/office/drawing/2010/main" val="0"/>
-                        </a:ext>
-                      </a:extLst>
-                    </a:blip>
+                    <a:blip r:embed="rId14"/>
                     <a:stretch>
                       <a:fillRect/>
                     </a:stretch>
@@ -1824,7 +3183,7 @@
                   <pic:spPr>
                     <a:xfrm>
                       <a:off x="0" y="0"/>
-                      <a:ext cx="5943600" cy="3706495"/>
+                      <a:ext cx="5943600" cy="4824730"/>
                     </a:xfrm>
                     <a:prstGeom prst="rect">
                       <a:avLst/>
@@ -1839,1354 +3198,307 @@
     </w:p>
     <w:p>
       <w:r>
-        <w:t xml:space="preserve">Entities: </w:t>
+        <w:t xml:space="preserve">Main </w:t>
+      </w:r>
+      <w:r>
+        <w:t>logic:</w:t>
+      </w:r>
+      <w:r>
+        <w:t xml:space="preserve"> </w:t>
+      </w:r>
+      <w:bookmarkStart w:id="11" w:name="_Toc242304782"/>
+      <w:r>
+        <w:t>For each patient, pick the single clinical note with the latest creation_date across all their admissions. Join patient → admission → clinical_note, then keep only the top row per patient (DISTINCT ON (patient_id) or ROW_NUMBER () = 1).</w:t>
+      </w:r>
+    </w:p>
+    <w:p>
+      <w:pPr>
+        <w:rPr>
+          <w:rFonts w:ascii="Segoe UI" w:hAnsi="Segoe UI" w:cs="Segoe UI"/>
+          <w:color w:val="0F1115"/>
+          <w:shd w:val="clear" w:color="auto" w:fill="FFFFFF"/>
+        </w:rPr>
+      </w:pPr>
+      <w:r>
+        <w:rPr>
+          <w:rFonts w:ascii="Segoe UI" w:hAnsi="Segoe UI" w:cs="Segoe UI"/>
+          <w:color w:val="0F1115"/>
+          <w:shd w:val="clear" w:color="auto" w:fill="FFFFFF"/>
+        </w:rPr>
+        <w:br w:type="page"/>
+      </w:r>
+    </w:p>
+    <w:p>
+      <w:pPr>
+        <w:rPr>
+          <w:rFonts w:ascii="Segoe UI" w:hAnsi="Segoe UI" w:cs="Segoe UI"/>
+          <w:color w:val="0F1115"/>
+          <w:shd w:val="clear" w:color="auto" w:fill="FFFFFF"/>
+        </w:rPr>
+      </w:pPr>
+      <w:r>
+        <w:rPr>
+          <w:rFonts w:ascii="Segoe UI" w:hAnsi="Segoe UI" w:cs="Segoe UI"/>
+          <w:color w:val="0F1115"/>
+          <w:shd w:val="clear" w:color="auto" w:fill="FFFFFF"/>
+        </w:rPr>
+        <w:lastRenderedPageBreak/>
+        <w:t>Q</w:t>
+      </w:r>
+      <w:r>
+        <w:rPr>
+          <w:rFonts w:ascii="Segoe UI" w:hAnsi="Segoe UI" w:cs="Segoe UI"/>
+          <w:color w:val="0F1115"/>
+          <w:shd w:val="clear" w:color="auto" w:fill="FFFFFF"/>
+        </w:rPr>
+        <w:t>19 – [Freddy Mvemba]</w:t>
+      </w:r>
+    </w:p>
+    <w:p>
+      <w:r>
+        <w:rPr>
+          <w:noProof/>
+        </w:rPr>
+        <w:drawing>
+          <wp:inline distT="0" distB="0" distL="0" distR="0" wp14:anchorId="1DD396B0" wp14:editId="7BC6271D">
+            <wp:extent cx="5943600" cy="1841500"/>
+            <wp:effectExtent l="0" t="0" r="0" b="6350"/>
+            <wp:docPr id="931874033" name="Picture 1"/>
+            <wp:cNvGraphicFramePr>
+              <a:graphicFrameLocks xmlns:a="http://schemas.openxmlformats.org/drawingml/2006/main" noChangeAspect="1"/>
+            </wp:cNvGraphicFramePr>
+            <a:graphic xmlns:a="http://schemas.openxmlformats.org/drawingml/2006/main">
+              <a:graphicData uri="http://schemas.openxmlformats.org/drawingml/2006/picture">
+                <pic:pic xmlns:pic="http://schemas.openxmlformats.org/drawingml/2006/picture">
+                  <pic:nvPicPr>
+                    <pic:cNvPr id="931874033" name=""/>
+                    <pic:cNvPicPr/>
+                  </pic:nvPicPr>
+                  <pic:blipFill>
+                    <a:blip r:embed="rId15"/>
+                    <a:stretch>
+                      <a:fillRect/>
+                    </a:stretch>
+                  </pic:blipFill>
+                  <pic:spPr>
+                    <a:xfrm>
+                      <a:off x="0" y="0"/>
+                      <a:ext cx="5943600" cy="1841500"/>
+                    </a:xfrm>
+                    <a:prstGeom prst="rect">
+                      <a:avLst/>
+                    </a:prstGeom>
+                  </pic:spPr>
+                </pic:pic>
+              </a:graphicData>
+            </a:graphic>
+          </wp:inline>
+        </w:drawing>
+      </w:r>
+    </w:p>
+    <w:p>
+      <w:r>
+        <w:t>Main logic</w:t>
+      </w:r>
+      <w:r>
+        <w:t xml:space="preserve">: </w:t>
+      </w:r>
+      <w:r>
+        <w:t> Find admissions where the patient died during the stay, by filtering discharge_record.condition_at_discharge = 'Deceased'. Join admission → patient → discharge_record, then LEFT JOIN diagnosis (on primary_diagnosis = TRUE) to attach the primary ICD-9 code.</w:t>
+      </w:r>
+    </w:p>
+    <w:p>
+      <w:pPr>
+        <w:rPr>
+          <w:rFonts w:ascii="Segoe UI" w:hAnsi="Segoe UI" w:cs="Segoe UI"/>
+          <w:color w:val="0F1115"/>
+          <w:shd w:val="clear" w:color="auto" w:fill="FFFFFF"/>
+        </w:rPr>
+      </w:pPr>
+      <w:r>
+        <w:rPr>
+          <w:rFonts w:ascii="Segoe UI" w:hAnsi="Segoe UI" w:cs="Segoe UI"/>
+          <w:color w:val="0F1115"/>
+          <w:shd w:val="clear" w:color="auto" w:fill="FFFFFF"/>
+        </w:rPr>
+        <w:t>Q20 – [Freddy Mvemba]</w:t>
+      </w:r>
+    </w:p>
+    <w:p>
+      <w:r>
+        <w:rPr>
+          <w:noProof/>
+        </w:rPr>
+        <w:drawing>
+          <wp:inline distT="0" distB="0" distL="0" distR="0" wp14:anchorId="44376572" wp14:editId="6BFDE191">
+            <wp:extent cx="5943600" cy="1127760"/>
+            <wp:effectExtent l="0" t="0" r="0" b="0"/>
+            <wp:docPr id="30280323" name="Picture 1"/>
+            <wp:cNvGraphicFramePr>
+              <a:graphicFrameLocks xmlns:a="http://schemas.openxmlformats.org/drawingml/2006/main" noChangeAspect="1"/>
+            </wp:cNvGraphicFramePr>
+            <a:graphic xmlns:a="http://schemas.openxmlformats.org/drawingml/2006/main">
+              <a:graphicData uri="http://schemas.openxmlformats.org/drawingml/2006/picture">
+                <pic:pic xmlns:pic="http://schemas.openxmlformats.org/drawingml/2006/picture">
+                  <pic:nvPicPr>
+                    <pic:cNvPr id="30280323" name=""/>
+                    <pic:cNvPicPr/>
+                  </pic:nvPicPr>
+                  <pic:blipFill>
+                    <a:blip r:embed="rId16"/>
+                    <a:stretch>
+                      <a:fillRect/>
+                    </a:stretch>
+                  </pic:blipFill>
+                  <pic:spPr>
+                    <a:xfrm>
+                      <a:off x="0" y="0"/>
+                      <a:ext cx="5943600" cy="1127760"/>
+                    </a:xfrm>
+                    <a:prstGeom prst="rect">
+                      <a:avLst/>
+                    </a:prstGeom>
+                  </pic:spPr>
+                </pic:pic>
+              </a:graphicData>
+            </a:graphic>
+          </wp:inline>
+        </w:drawing>
+      </w:r>
+    </w:p>
+    <w:p>
+      <w:pPr>
+        <w:pStyle w:val="ds-markdown-paragraph"/>
+        <w:shd w:val="clear" w:color="auto" w:fill="FFFFFF"/>
+        <w:spacing w:before="0" w:beforeAutospacing="0" w:after="0" w:afterAutospacing="0" w:line="420" w:lineRule="atLeast"/>
+        <w:rPr>
+          <w:rFonts w:ascii="Segoe UI" w:hAnsi="Segoe UI" w:cs="Segoe UI"/>
+          <w:color w:val="0F1115"/>
+        </w:rPr>
+      </w:pPr>
+      <w:r>
+        <w:t xml:space="preserve">Main logic: </w:t>
+      </w:r>
+      <w:r>
+        <w:t xml:space="preserve">Find patients who had both a surgery and a radiology exam on the same calendar day in the same admission. Join patient → admission → surgical_procedure, then admission → diagnostic_order → radiology_examination (radiology routes through the order, not the admission), and filter with </w:t>
+      </w:r>
+      <w:r>
+        <w:t>DATE (</w:t>
+      </w:r>
+      <w:r>
+        <w:t xml:space="preserve">surgery_time) = </w:t>
+      </w:r>
+      <w:r>
+        <w:t>DATE (</w:t>
+      </w:r>
+      <w:r>
+        <w:t>exam_time).</w:t>
+      </w:r>
+    </w:p>
+    <w:p/>
+    <w:p>
+      <w:r>
+        <w:br w:type="page"/>
+      </w:r>
+    </w:p>
+    <w:p>
+      <w:r>
+        <w:lastRenderedPageBreak/>
+        <w:t>Appendix B — Handout Checklist</w:t>
+      </w:r>
+      <w:bookmarkEnd w:id="11"/>
+    </w:p>
+    <w:p/>
+    <w:p>
+      <w:r>
+        <w:t>- [x] Include one SQL query for every question.</w:t>
+      </w:r>
+    </w:p>
+    <w:p>
+      <w:r>
+        <w:t xml:space="preserve">- [x] </w:t>
+      </w:r>
+      <w:r>
+        <w:t>Comment on</w:t>
+      </w:r>
+      <w:r>
+        <w:t xml:space="preserve"> the main logic of each query.</w:t>
+      </w:r>
+    </w:p>
+    <w:p>
+      <w:r>
+        <w:t>- [x] Use valid, consistently indented, readable SQL.</w:t>
+      </w:r>
+    </w:p>
+    <w:p>
+      <w:r>
+        <w:t>- [x] Apply joins, grouping, subqueries, aggregates, date/time functions, and CTEs where appropriate.</w:t>
+      </w:r>
+    </w:p>
+    <w:p>
+      <w:r>
+        <w:t xml:space="preserve">- [x] Use </w:t>
       </w:r>
       <w:r>
         <w:rPr>
           <w:i/>
         </w:rPr>
-        <w:t>icd9_dict</w:t>
-      </w:r>
-      <w:r>
-        <w:t xml:space="preserve">, </w:t>
+        <w:t>LEFT JOIN</w:t>
+      </w:r>
+      <w:r>
+        <w:t xml:space="preserve"> or </w:t>
       </w:r>
       <w:r>
         <w:rPr>
           <w:i/>
         </w:rPr>
-        <w:t>physician</w:t>
-      </w:r>
-      <w:r>
-        <w:t xml:space="preserve">, </w:t>
+        <w:t>NOT EXISTS</w:t>
+      </w:r>
+      <w:r>
+        <w:t xml:space="preserve"> to identify patients with no related records.</w:t>
+      </w:r>
+    </w:p>
+    <w:p>
+      <w:r>
+        <w:t>- [x] Calculate length of stay from entry and exit timestamps.</w:t>
+      </w:r>
+    </w:p>
+    <w:p>
+      <w:r>
+        <w:t>- [x] Include only completed admissions with discharge timestamps in the relevant counts.</w:t>
+      </w:r>
+    </w:p>
+    <w:p>
+      <w:r>
+        <w:t>- [x] Confirm that each completed admission has at least one primary ICD-9 diagnosis.</w:t>
+      </w:r>
+    </w:p>
+    <w:p>
+      <w:r>
+        <w:t>- [x] Complete all 20 queries, assigning approximately four or five to each member.</w:t>
+      </w:r>
+    </w:p>
+    <w:p>
+      <w:r>
+        <w:t>- [x] Clearly document each member’s contribution.</w:t>
+      </w:r>
+    </w:p>
+    <w:p>
+      <w:r>
+        <w:t xml:space="preserve">- [x] Submit the PDF in a ZIP file named </w:t>
       </w:r>
       <w:r>
         <w:rPr>
           <w:i/>
         </w:rPr>
-        <w:t>nurse</w:t>
-      </w:r>
-      <w:r>
-        <w:t xml:space="preserve">, </w:t>
+        <w:t>SOEN363_Project_Phase1_</w:t>
       </w:r>
       <w:r>
         <w:rPr>
           <w:i/>
         </w:rPr>
-        <w:t>patient</w:t>
-      </w:r>
-      <w:r>
-        <w:t xml:space="preserve">, </w:t>
-      </w:r>
-      <w:r>
-        <w:rPr>
-          <w:i/>
-        </w:rPr>
-        <w:t>admission</w:t>
-      </w:r>
-      <w:r>
-        <w:t xml:space="preserve">, </w:t>
-      </w:r>
-      <w:r>
-        <w:rPr>
-          <w:i/>
-        </w:rPr>
-        <w:t>triage</w:t>
-      </w:r>
-      <w:r>
-        <w:rPr>
-          <w:i/>
-        </w:rPr>
-        <w:t>_</w:t>
-      </w:r>
-      <w:r>
-        <w:rPr>
-          <w:i/>
-        </w:rPr>
-        <w:t>assessment</w:t>
-      </w:r>
-      <w:r>
-        <w:t xml:space="preserve">, </w:t>
-      </w:r>
-      <w:r>
-        <w:rPr>
-          <w:i/>
-        </w:rPr>
-        <w:t>diagnosis</w:t>
-      </w:r>
-      <w:r>
-        <w:t xml:space="preserve">, </w:t>
-      </w:r>
-      <w:r>
-        <w:rPr>
-          <w:i/>
-        </w:rPr>
-        <w:t>icu_stay</w:t>
-      </w:r>
-      <w:r>
-        <w:t xml:space="preserve">, </w:t>
-      </w:r>
-      <w:r>
-        <w:rPr>
-          <w:i/>
-        </w:rPr>
-        <w:t>clinical note</w:t>
-      </w:r>
-      <w:r>
-        <w:t xml:space="preserve">, </w:t>
-      </w:r>
-      <w:r>
-        <w:rPr>
-          <w:i/>
-        </w:rPr>
-        <w:t>diagnostic order</w:t>
-      </w:r>
-      <w:r>
-        <w:t xml:space="preserve">, </w:t>
-      </w:r>
-      <w:r>
-        <w:rPr>
-          <w:i/>
-        </w:rPr>
-        <w:t>radiology_examination</w:t>
-      </w:r>
-      <w:r>
-        <w:t xml:space="preserve">, </w:t>
-      </w:r>
-      <w:r>
-        <w:rPr>
-          <w:i/>
-        </w:rPr>
-        <w:t>radiology_report</w:t>
-      </w:r>
-      <w:r>
-        <w:t xml:space="preserve">, </w:t>
-      </w:r>
-      <w:r>
-        <w:rPr>
-          <w:i/>
-        </w:rPr>
-        <w:t>discharge record</w:t>
-      </w:r>
-      <w:r>
-        <w:t xml:space="preserve">, and </w:t>
-      </w:r>
-      <w:r>
-        <w:rPr>
-          <w:i/>
-        </w:rPr>
-        <w:t>surgical procedure</w:t>
-      </w:r>
-      <w:r>
-        <w:t>.</w:t>
-      </w:r>
-    </w:p>
-    <w:p>
-      <w:r>
-        <w:t>Key relationships:</w:t>
-      </w:r>
-    </w:p>
-    <w:p>
-      <w:pPr>
-        <w:pStyle w:val="ListParagraph"/>
-        <w:numPr>
-          <w:ilvl w:val="0"/>
-          <w:numId w:val="8"/>
-        </w:numPr>
-      </w:pPr>
-      <w:r>
-        <w:t>One patient may have many admissions.</w:t>
-      </w:r>
-    </w:p>
-    <w:p>
-      <w:pPr>
-        <w:pStyle w:val="ListParagraph"/>
-        <w:numPr>
-          <w:ilvl w:val="0"/>
-          <w:numId w:val="8"/>
-        </w:numPr>
-      </w:pPr>
-      <w:r>
-        <w:t>Each admission has one triage assessment.</w:t>
-      </w:r>
-    </w:p>
-    <w:p>
-      <w:pPr>
-        <w:pStyle w:val="ListParagraph"/>
-        <w:numPr>
-          <w:ilvl w:val="0"/>
-          <w:numId w:val="8"/>
-        </w:numPr>
-      </w:pPr>
-      <w:r>
-        <w:t>Each admission may have multiple diagnoses, including one required primary diagnosis.</w:t>
-      </w:r>
-    </w:p>
-    <w:p>
-      <w:pPr>
-        <w:pStyle w:val="ListParagraph"/>
-        <w:numPr>
-          <w:ilvl w:val="0"/>
-          <w:numId w:val="8"/>
-        </w:numPr>
-      </w:pPr>
-      <w:r>
-        <w:t>Admission</w:t>
-      </w:r>
-      <w:r>
-        <w:t xml:space="preserve"> may have at most one ICU stay.</w:t>
-      </w:r>
-    </w:p>
-    <w:p>
-      <w:pPr>
-        <w:pStyle w:val="ListParagraph"/>
-        <w:numPr>
-          <w:ilvl w:val="0"/>
-          <w:numId w:val="8"/>
-        </w:numPr>
-      </w:pPr>
-      <w:r>
-        <w:t>Each admission may include multiple clinical notes.</w:t>
-      </w:r>
-    </w:p>
-    <w:p>
-      <w:pPr>
-        <w:pStyle w:val="ListParagraph"/>
-        <w:numPr>
-          <w:ilvl w:val="0"/>
-          <w:numId w:val="8"/>
-        </w:numPr>
-      </w:pPr>
-      <w:r>
-        <w:t>Each admission may have multiple diagnostic orders; each order links to one radiology examination, and each examination links to one radiology report.</w:t>
-      </w:r>
-    </w:p>
-    <w:p>
-      <w:pPr>
-        <w:pStyle w:val="ListParagraph"/>
-        <w:numPr>
-          <w:ilvl w:val="0"/>
-          <w:numId w:val="8"/>
-        </w:numPr>
-      </w:pPr>
-      <w:r>
-        <w:t>Each admission may have one discharge record.</w:t>
-      </w:r>
-    </w:p>
-    <w:p>
-      <w:pPr>
-        <w:pStyle w:val="ListParagraph"/>
-        <w:numPr>
-          <w:ilvl w:val="0"/>
-          <w:numId w:val="8"/>
-        </w:numPr>
-      </w:pPr>
-      <w:r>
-        <w:t>Each admission may include multiple surgical procedures.</w:t>
-      </w:r>
-    </w:p>
-    <w:p>
-      <w:r>
-        <w:t>The diagram identifies all cardinality and participation constraints</w:t>
-      </w:r>
-    </w:p>
-    <w:p>
-      <w:pPr>
-        <w:pStyle w:val="Heading1"/>
-        <w:rPr>
-          <w:rFonts w:cstheme="minorBidi"/>
-        </w:rPr>
-      </w:pPr>
-      <w:bookmarkStart w:id="4" w:name="_Toc242304775"/>
-      <w:r>
-        <w:rPr>
-          <w:rFonts w:cstheme="minorBidi"/>
-        </w:rPr>
-        <w:lastRenderedPageBreak/>
-        <w:t>Relational Schema</w:t>
-      </w:r>
-      <w:bookmarkEnd w:id="4"/>
-    </w:p>
-    <w:p>
-      <w:r>
-        <w:t xml:space="preserve">All tables </w:t>
-      </w:r>
-      <w:r>
-        <w:t>satisfy</w:t>
-      </w:r>
-      <w:r>
-        <w:t xml:space="preserve"> third normal form (3NF), </w:t>
-      </w:r>
-      <w:r>
-        <w:t>eliminating</w:t>
-      </w:r>
-      <w:r>
-        <w:t xml:space="preserve"> partial </w:t>
-      </w:r>
-      <w:r>
-        <w:t>and</w:t>
-      </w:r>
-      <w:r>
-        <w:t xml:space="preserve"> transitive dependencies</w:t>
-      </w:r>
-    </w:p>
-    <w:p>
-      <w:pPr>
-        <w:pStyle w:val="Heading1"/>
-        <w:rPr>
-          <w:rFonts w:cstheme="minorBidi"/>
-        </w:rPr>
-      </w:pPr>
-      <w:bookmarkStart w:id="5" w:name="_Toc242304776"/>
-      <w:r>
-        <w:rPr>
-          <w:rFonts w:cstheme="minorBidi"/>
-        </w:rPr>
-        <w:t>Data Population</w:t>
-      </w:r>
-      <w:bookmarkEnd w:id="5"/>
-    </w:p>
-    <w:p>
-      <w:r>
-        <w:t xml:space="preserve">The </w:t>
-      </w:r>
-      <w:r>
-        <w:rPr>
-          <w:i/>
-        </w:rPr>
-        <w:t>generate_data.py</w:t>
-      </w:r>
-      <w:r>
-        <w:t xml:space="preserve"> script creates </w:t>
-      </w:r>
-      <w:r>
-        <w:rPr>
-          <w:i/>
-        </w:rPr>
-        <w:t>populate_all_hospital.sql</w:t>
-      </w:r>
-      <w:r>
-        <w:t>, which contains the sample-data INSERT statements.</w:t>
-      </w:r>
-    </w:p>
-    <w:p>
-      <w:r>
-        <w:t>The generated dataset includes:</w:t>
-      </w:r>
-    </w:p>
-    <w:p>
-      <w:pPr>
-        <w:pStyle w:val="ListParagraph"/>
-        <w:numPr>
-          <w:ilvl w:val="0"/>
-          <w:numId w:val="9"/>
-        </w:numPr>
-      </w:pPr>
-      <w:r>
-        <w:t>4 ICD-9 codes, 15 physicians, 10 nurses, and 40 patients.</w:t>
-      </w:r>
-    </w:p>
-    <w:p>
-      <w:pPr>
-        <w:pStyle w:val="ListParagraph"/>
-        <w:numPr>
-          <w:ilvl w:val="0"/>
-          <w:numId w:val="9"/>
-        </w:numPr>
-      </w:pPr>
-      <w:r>
-        <w:t xml:space="preserve">50 admissions, 50 triage assessments, </w:t>
-      </w:r>
-      <w:r>
-        <w:t>about</w:t>
-      </w:r>
-      <w:r>
-        <w:t xml:space="preserve"> 75 diagnoses, </w:t>
-      </w:r>
-      <w:r>
-        <w:t>about</w:t>
-      </w:r>
-      <w:r>
-        <w:t xml:space="preserve"> 25 ICU stays, and 50 clinical notes.</w:t>
-      </w:r>
-    </w:p>
-    <w:p>
-      <w:pPr>
-        <w:pStyle w:val="ListParagraph"/>
-        <w:numPr>
-          <w:ilvl w:val="0"/>
-          <w:numId w:val="9"/>
-        </w:numPr>
-      </w:pPr>
-      <w:r>
-        <w:t>About 25 diagnostic orders, radiology examinations, and radiology reports.</w:t>
-      </w:r>
-    </w:p>
-    <w:p>
-      <w:pPr>
-        <w:pStyle w:val="ListParagraph"/>
-        <w:numPr>
-          <w:ilvl w:val="0"/>
-          <w:numId w:val="9"/>
-        </w:numPr>
-      </w:pPr>
-      <w:r>
-        <w:t xml:space="preserve">50 discharge records and </w:t>
-      </w:r>
-      <w:r>
-        <w:t>about</w:t>
-      </w:r>
-      <w:r>
-        <w:t xml:space="preserve"> 15–20 surgical procedures.</w:t>
-      </w:r>
-    </w:p>
-    <w:p>
-      <w:pPr>
-        <w:pStyle w:val="ListParagraph"/>
-        <w:numPr>
-          <w:ilvl w:val="0"/>
-          <w:numId w:val="9"/>
-        </w:numPr>
-      </w:pPr>
-      <w:r>
-        <w:t>The generator applies these realism safeguards:</w:t>
-      </w:r>
-    </w:p>
-    <w:p>
-      <w:pPr>
-        <w:pStyle w:val="ListParagraph"/>
-        <w:numPr>
-          <w:ilvl w:val="0"/>
-          <w:numId w:val="9"/>
-        </w:numPr>
-      </w:pPr>
-      <w:r>
-        <w:t>All timestamps are historical.</w:t>
-      </w:r>
-    </w:p>
-    <w:p>
-      <w:pPr>
-        <w:pStyle w:val="ListParagraph"/>
-        <w:numPr>
-          <w:ilvl w:val="0"/>
-          <w:numId w:val="9"/>
-        </w:numPr>
-      </w:pPr>
-      <w:r>
-        <w:t xml:space="preserve">ICU exit times </w:t>
-      </w:r>
-      <w:r>
-        <w:t>never occur after</w:t>
-      </w:r>
-      <w:r>
-        <w:t xml:space="preserve"> discharge.</w:t>
-      </w:r>
-    </w:p>
-    <w:p>
-      <w:pPr>
-        <w:pStyle w:val="ListParagraph"/>
-        <w:numPr>
-          <w:ilvl w:val="0"/>
-          <w:numId w:val="9"/>
-        </w:numPr>
-      </w:pPr>
-      <w:r>
-        <w:t xml:space="preserve">Patients who die during a stay </w:t>
-      </w:r>
-      <w:r>
-        <w:t xml:space="preserve">are assigned </w:t>
-      </w:r>
-      <w:r>
-        <w:rPr>
-          <w:i/>
-        </w:rPr>
-        <w:t>life_status = 'Deceased'</w:t>
-      </w:r>
-      <w:r>
-        <w:t xml:space="preserve"> and </w:t>
-      </w:r>
-      <w:r>
-        <w:t xml:space="preserve">have </w:t>
-      </w:r>
-      <w:r>
-        <w:t>a corresponding discharge record.</w:t>
-      </w:r>
-    </w:p>
-    <w:p>
-      <w:r>
-        <w:t xml:space="preserve">For reproducibility, </w:t>
-      </w:r>
-      <w:r>
-        <w:rPr>
-          <w:i/>
-        </w:rPr>
-        <w:t>random. seed</w:t>
-      </w:r>
-      <w:r>
-        <w:rPr>
-          <w:i/>
-        </w:rPr>
-        <w:t>(42</w:t>
-      </w:r>
-      <w:r>
-        <w:rPr>
-          <w:i/>
-          <w:iCs/>
-        </w:rPr>
-        <w:t>)</w:t>
-      </w:r>
-      <w:r>
-        <w:t xml:space="preserve"> produces the same dataset on every run.</w:t>
-      </w:r>
-    </w:p>
-    <w:p>
-      <w:pPr>
-        <w:pStyle w:val="Heading1"/>
-        <w:rPr>
-          <w:rFonts w:cstheme="minorBidi"/>
-        </w:rPr>
-      </w:pPr>
-      <w:bookmarkStart w:id="6" w:name="_Toc242304777"/>
-      <w:r>
-        <w:rPr>
-          <w:rFonts w:cstheme="minorBidi"/>
-        </w:rPr>
-        <w:t>Queries (Q1</w:t>
-      </w:r>
-      <w:r>
-        <w:rPr>
-          <w:rFonts w:cstheme="minorBidi"/>
-        </w:rPr>
-        <w:t>–</w:t>
-      </w:r>
-      <w:r>
-        <w:rPr>
-          <w:rFonts w:cstheme="minorBidi"/>
-        </w:rPr>
-        <w:t>Q20)</w:t>
-      </w:r>
-      <w:bookmarkEnd w:id="6"/>
-    </w:p>
-    <w:p>
-      <w:r>
-        <w:t>Each team member must complete four or five queries, as required by the handout.</w:t>
-      </w:r>
-    </w:p>
-    <w:p>
-      <w:r>
-        <w:t>Query assignments:</w:t>
-      </w:r>
-    </w:p>
-    <w:p>
-      <w:pPr>
-        <w:pStyle w:val="ListParagraph"/>
-        <w:numPr>
-          <w:ilvl w:val="0"/>
-          <w:numId w:val="16"/>
-        </w:numPr>
-        <w:rPr>
-          <w:lang w:val="fr-FR"/>
-        </w:rPr>
-      </w:pPr>
-      <w:r>
-        <w:rPr>
-          <w:lang w:val="fr-FR"/>
-        </w:rPr>
-        <w:t>@Zitkq — Q1–Q4</w:t>
-      </w:r>
-    </w:p>
-    <w:p>
-      <w:pPr>
-        <w:pStyle w:val="ListParagraph"/>
-        <w:numPr>
-          <w:ilvl w:val="0"/>
-          <w:numId w:val="16"/>
-        </w:numPr>
-        <w:rPr>
-          <w:lang w:val="fr-FR"/>
-        </w:rPr>
-      </w:pPr>
-      <w:r>
-        <w:rPr>
-          <w:lang w:val="fr-FR"/>
-        </w:rPr>
-        <w:t>@JuanMa_487 — Q5–Q8</w:t>
-      </w:r>
-    </w:p>
-    <w:p>
-      <w:pPr>
-        <w:pStyle w:val="ListParagraph"/>
-        <w:numPr>
-          <w:ilvl w:val="0"/>
-          <w:numId w:val="16"/>
-        </w:numPr>
-        <w:rPr>
-          <w:lang w:val="fr-FR"/>
-        </w:rPr>
-      </w:pPr>
-      <w:r>
-        <w:rPr>
-          <w:lang w:val="fr-FR"/>
-        </w:rPr>
-        <w:t>@Mohammad — Q9–Q12</w:t>
-      </w:r>
-    </w:p>
-    <w:p>
-      <w:pPr>
-        <w:pStyle w:val="ListParagraph"/>
-        <w:numPr>
-          <w:ilvl w:val="0"/>
-          <w:numId w:val="16"/>
-        </w:numPr>
-        <w:rPr>
-          <w:lang w:val="fr-FR"/>
-        </w:rPr>
-      </w:pPr>
-      <w:r>
-        <w:rPr>
-          <w:lang w:val="fr-FR"/>
-        </w:rPr>
-        <w:t>@Laurent — Q13–Q16</w:t>
-      </w:r>
-    </w:p>
-    <w:p>
-      <w:pPr>
-        <w:pStyle w:val="ListParagraph"/>
-        <w:numPr>
-          <w:ilvl w:val="0"/>
-          <w:numId w:val="16"/>
-        </w:numPr>
-      </w:pPr>
-      <w:r>
-        <w:t>@fmvemba — Q17–Q20</w:t>
-      </w:r>
-    </w:p>
-    <w:p>
-      <w:r>
-        <w:t xml:space="preserve">For </w:t>
-      </w:r>
-      <w:r>
-        <w:t>every</w:t>
-      </w:r>
-      <w:r>
-        <w:t xml:space="preserve"> query, </w:t>
-      </w:r>
-      <w:r>
-        <w:t>provide</w:t>
-      </w:r>
-      <w:r>
-        <w:t>:</w:t>
-      </w:r>
-    </w:p>
-    <w:p>
-      <w:pPr>
-        <w:pStyle w:val="ListParagraph"/>
-        <w:numPr>
-          <w:ilvl w:val="0"/>
-          <w:numId w:val="13"/>
-        </w:numPr>
-      </w:pPr>
-      <w:r>
-        <w:t>The complete SQL statement.</w:t>
-      </w:r>
-    </w:p>
-    <w:p>
-      <w:pPr>
-        <w:pStyle w:val="ListParagraph"/>
-        <w:numPr>
-          <w:ilvl w:val="0"/>
-          <w:numId w:val="13"/>
-        </w:numPr>
-      </w:pPr>
-      <w:r>
-        <w:t xml:space="preserve">A </w:t>
-      </w:r>
-      <w:r>
-        <w:t xml:space="preserve">pgAdmin </w:t>
-      </w:r>
-      <w:r>
-        <w:t xml:space="preserve">screenshot </w:t>
-      </w:r>
-      <w:r>
-        <w:t>showing</w:t>
-      </w:r>
-      <w:r>
-        <w:t xml:space="preserve"> the result.</w:t>
-      </w:r>
-    </w:p>
-    <w:p>
-      <w:pPr>
-        <w:pStyle w:val="ListParagraph"/>
-        <w:numPr>
-          <w:ilvl w:val="0"/>
-          <w:numId w:val="13"/>
-        </w:numPr>
-      </w:pPr>
-      <w:r>
-        <w:t xml:space="preserve">A </w:t>
-      </w:r>
-      <w:r>
-        <w:t>concise</w:t>
-      </w:r>
-      <w:r>
-        <w:t xml:space="preserve"> explanation of the </w:t>
-      </w:r>
-      <w:r>
-        <w:t>query’s</w:t>
-      </w:r>
-      <w:r>
-        <w:t xml:space="preserve"> logic and </w:t>
-      </w:r>
-      <w:r>
-        <w:t>output</w:t>
-      </w:r>
-    </w:p>
-    <w:p>
-      <w:pPr>
-        <w:pStyle w:val="Heading1"/>
-      </w:pPr>
-      <w:bookmarkStart w:id="7" w:name="_Toc242304778"/>
-      <w:r>
-        <w:lastRenderedPageBreak/>
-        <w:t>Submitted</w:t>
-      </w:r>
-      <w:r>
-        <w:t xml:space="preserve"> Files</w:t>
-      </w:r>
-      <w:bookmarkEnd w:id="7"/>
-    </w:p>
-    <w:p>
-      <w:r>
-        <w:t>| File | Purpose |</w:t>
-      </w:r>
-    </w:p>
-    <w:p>
-      <w:r>
-        <w:t xml:space="preserve">| </w:t>
-      </w:r>
-      <w:r>
-        <w:rPr>
-          <w:i/>
-        </w:rPr>
-        <w:t>TablesCreation.sql</w:t>
-      </w:r>
-      <w:r>
-        <w:t xml:space="preserve"> | </w:t>
-      </w:r>
-      <w:r>
-        <w:t>Creates</w:t>
-      </w:r>
-      <w:r>
-        <w:t xml:space="preserve"> all 14 tables and </w:t>
-      </w:r>
-      <w:r>
-        <w:t xml:space="preserve">defines </w:t>
-      </w:r>
-      <w:r>
-        <w:t>their constraints. |</w:t>
-      </w:r>
-    </w:p>
-    <w:p>
-      <w:r>
-        <w:t xml:space="preserve">| </w:t>
-      </w:r>
-      <w:r>
-        <w:rPr>
-          <w:i/>
-        </w:rPr>
-        <w:t>generate_data.py</w:t>
-      </w:r>
-      <w:r>
-        <w:t xml:space="preserve"> | </w:t>
-      </w:r>
-      <w:r>
-        <w:t>Generates</w:t>
-      </w:r>
-      <w:r>
-        <w:t xml:space="preserve"> the </w:t>
-      </w:r>
-      <w:r>
-        <w:t xml:space="preserve">database </w:t>
-      </w:r>
-      <w:r>
-        <w:t>INSERT statements. |</w:t>
-      </w:r>
-    </w:p>
-    <w:p>
-      <w:r>
-        <w:t xml:space="preserve">| </w:t>
-      </w:r>
-      <w:r>
-        <w:rPr>
-          <w:i/>
-        </w:rPr>
-        <w:t>populate_all_hospital.sql</w:t>
-      </w:r>
-      <w:r>
-        <w:t xml:space="preserve"> | </w:t>
-      </w:r>
-      <w:r>
-        <w:t>Populates</w:t>
-      </w:r>
-      <w:r>
-        <w:t xml:space="preserve"> the database</w:t>
-      </w:r>
-      <w:r>
-        <w:t xml:space="preserve"> with the complete sample dataset.</w:t>
-      </w:r>
-      <w:r>
-        <w:t xml:space="preserve"> |</w:t>
-      </w:r>
-    </w:p>
-    <w:p>
-      <w:r>
-        <w:t xml:space="preserve">| </w:t>
-      </w:r>
-      <w:r>
-        <w:rPr>
-          <w:i/>
-        </w:rPr>
-        <w:t>FirstPart.sql</w:t>
-      </w:r>
-      <w:r>
-        <w:t xml:space="preserve"> | </w:t>
-      </w:r>
-      <w:r>
-        <w:t>Contains the final</w:t>
-      </w:r>
-      <w:r>
-        <w:t xml:space="preserve"> 20 SQL queries, Q1</w:t>
-      </w:r>
-      <w:r>
-        <w:t>–</w:t>
-      </w:r>
-      <w:r>
-        <w:t>Q20. |</w:t>
-      </w:r>
-    </w:p>
-    <w:p>
-      <w:r>
-        <w:t xml:space="preserve">| </w:t>
-      </w:r>
-      <w:r>
-        <w:rPr>
-          <w:i/>
-        </w:rPr>
-        <w:t>CheckTables.sql</w:t>
-      </w:r>
-      <w:r>
-        <w:t xml:space="preserve"> | </w:t>
-      </w:r>
-      <w:r>
-        <w:t>Verifies</w:t>
-      </w:r>
-      <w:r>
-        <w:t xml:space="preserve"> table contents</w:t>
-      </w:r>
-      <w:r>
-        <w:t xml:space="preserve"> and expected row counts.</w:t>
-      </w:r>
-      <w:r>
-        <w:t xml:space="preserve"> |</w:t>
-      </w:r>
-    </w:p>
-    <w:p>
-      <w:r>
-        <w:t xml:space="preserve">| ER diagram </w:t>
-      </w:r>
-      <w:proofErr w:type="gramStart"/>
-      <w:r>
-        <w:t>(</w:t>
-      </w:r>
-      <w:r>
-        <w:t>.drawio</w:t>
-      </w:r>
-      <w:proofErr w:type="gramEnd"/>
-      <w:r>
-        <w:t xml:space="preserve"> / </w:t>
-      </w:r>
-      <w:r>
-        <w:t>.png</w:t>
-      </w:r>
-      <w:r>
-        <w:t>) | Presents the entity-relationship model. |</w:t>
-      </w:r>
-    </w:p>
-    <w:p>
-      <w:r>
-        <w:t xml:space="preserve">| </w:t>
-      </w:r>
-      <w:r>
-        <w:rPr>
-          <w:i/>
-          <w:iCs/>
-        </w:rPr>
-        <w:t>README.md</w:t>
-      </w:r>
-      <w:r>
-        <w:t xml:space="preserve"> | Explains how to reproduce the database. |</w:t>
-      </w:r>
-    </w:p>
-    <w:p>
-      <w:pPr>
-        <w:pStyle w:val="Heading1"/>
-        <w:rPr>
-          <w:rFonts w:cstheme="minorBidi"/>
-        </w:rPr>
-      </w:pPr>
-      <w:bookmarkStart w:id="8" w:name="_Toc242304779"/>
-      <w:r>
-        <w:rPr>
-          <w:rFonts w:cstheme="minorBidi"/>
-        </w:rPr>
-        <w:t>Reproduction Steps</w:t>
-      </w:r>
-      <w:bookmarkEnd w:id="8"/>
-    </w:p>
-    <w:p>
-      <w:r>
-        <w:t xml:space="preserve">1. Create an empty PostgreSQL database named </w:t>
-      </w:r>
-      <w:r>
-        <w:rPr>
-          <w:i/>
-        </w:rPr>
-        <w:t>Superbase</w:t>
-      </w:r>
-      <w:r>
-        <w:rPr>
-          <w:i/>
-        </w:rPr>
-        <w:t xml:space="preserve"> HMS</w:t>
-      </w:r>
-      <w:r>
-        <w:t>.</w:t>
-      </w:r>
-    </w:p>
-    <w:p>
-      <w:r>
-        <w:t xml:space="preserve">2. Run </w:t>
-      </w:r>
-      <w:r>
-        <w:rPr>
-          <w:i/>
-        </w:rPr>
-        <w:t>TablesCreation.sql</w:t>
-      </w:r>
-      <w:r>
-        <w:t xml:space="preserve"> to </w:t>
-      </w:r>
-      <w:r>
-        <w:t>create</w:t>
-      </w:r>
-      <w:r>
-        <w:t xml:space="preserve"> the </w:t>
-      </w:r>
-      <w:r>
-        <w:t xml:space="preserve">database </w:t>
-      </w:r>
-      <w:r>
-        <w:t>schema.</w:t>
-      </w:r>
-    </w:p>
-    <w:p>
-      <w:r>
-        <w:t xml:space="preserve">3. Run </w:t>
-      </w:r>
-      <w:r>
-        <w:rPr>
-          <w:i/>
-        </w:rPr>
-        <w:t>populate_all_hospital.sql</w:t>
-      </w:r>
-      <w:r>
-        <w:t xml:space="preserve"> to </w:t>
-      </w:r>
-      <w:r>
-        <w:t>load</w:t>
-      </w:r>
-      <w:r>
-        <w:t xml:space="preserve"> the sample data.</w:t>
-      </w:r>
-    </w:p>
-    <w:p>
-      <w:r>
-        <w:t xml:space="preserve">4. Run </w:t>
-      </w:r>
-      <w:r>
-        <w:rPr>
-          <w:i/>
-        </w:rPr>
-        <w:t>CheckTables.sql</w:t>
-      </w:r>
-      <w:r>
-        <w:t xml:space="preserve"> </w:t>
-      </w:r>
-      <w:r>
-        <w:t>and verify</w:t>
-      </w:r>
-      <w:r>
-        <w:t xml:space="preserve"> the expected row counts.</w:t>
-      </w:r>
-    </w:p>
-    <w:p>
-      <w:r>
-        <w:t xml:space="preserve">5. Run Q1 through Q20 from </w:t>
-      </w:r>
-      <w:r>
-        <w:rPr>
-          <w:i/>
-          <w:iCs/>
-        </w:rPr>
-        <w:t>FirstPart.sql</w:t>
-      </w:r>
-      <w:r>
-        <w:t>.</w:t>
-      </w:r>
-    </w:p>
-    <w:p>
-      <w:pPr>
-        <w:pStyle w:val="Heading1"/>
-        <w:rPr>
-          <w:rFonts w:cstheme="minorBidi"/>
-        </w:rPr>
-      </w:pPr>
-      <w:bookmarkStart w:id="9" w:name="_Toc242304780"/>
-      <w:r>
-        <w:rPr>
-          <w:rFonts w:cstheme="minorBidi"/>
-        </w:rPr>
-        <w:t>Conclusion</w:t>
-      </w:r>
-      <w:bookmarkEnd w:id="9"/>
-    </w:p>
-    <w:p>
-      <w:r>
-        <w:t xml:space="preserve">The team </w:t>
-      </w:r>
-      <w:r>
-        <w:t>designed</w:t>
-      </w:r>
-      <w:r>
-        <w:t xml:space="preserve"> a normalized 14-table HMS database, populated it with realistic sample data, and </w:t>
-      </w:r>
-      <w:r>
-        <w:t>completed</w:t>
-      </w:r>
-      <w:r>
-        <w:t xml:space="preserve"> 20 SQL queries using </w:t>
-      </w:r>
-      <w:r>
-        <w:t>joints</w:t>
-      </w:r>
-      <w:r>
-        <w:t>, aggregates, subqueries, and CTEs.</w:t>
-      </w:r>
-    </w:p>
-    <w:p>
-      <w:r>
-        <w:t xml:space="preserve">The project </w:t>
-      </w:r>
-      <w:r>
-        <w:t>deepened</w:t>
-      </w:r>
-      <w:r>
-        <w:t xml:space="preserve"> the team’s understanding of schema</w:t>
-      </w:r>
-      <w:r>
-        <w:t xml:space="preserve"> </w:t>
-      </w:r>
-      <w:r>
-        <w:t>design, constraint enforcement, and reproducible data generation.</w:t>
-      </w:r>
-    </w:p>
-    <w:p/>
-    <w:p>
-      <w:pPr>
-        <w:rPr>
-          <w:rFonts w:asciiTheme="majorHAnsi" w:eastAsiaTheme="majorEastAsia" w:hAnsiTheme="majorHAnsi"/>
-          <w:color w:val="0F4761" w:themeColor="accent1" w:themeShade="BF"/>
-          <w:sz w:val="40"/>
-          <w:szCs w:val="40"/>
-        </w:rPr>
-      </w:pPr>
-      <w:r>
-        <w:br w:type="page"/>
-      </w:r>
-    </w:p>
-    <w:p>
-      <w:pPr>
-        <w:pStyle w:val="Heading1"/>
-        <w:rPr>
-          <w:rFonts w:cstheme="minorBidi"/>
-        </w:rPr>
-      </w:pPr>
-      <w:bookmarkStart w:id="10" w:name="_Toc242304781"/>
-      <w:r>
-        <w:rPr>
-          <w:rFonts w:cstheme="minorBidi"/>
-        </w:rPr>
-        <w:lastRenderedPageBreak/>
-        <w:t>Appendix A — Individual Query Screenshots</w:t>
-      </w:r>
-      <w:bookmarkEnd w:id="10"/>
-    </w:p>
-    <w:p/>
-    <w:p>
-      <w:r>
-        <w:t xml:space="preserve">- </w:t>
-      </w:r>
-      <w:proofErr w:type="gramStart"/>
-      <w:r>
-        <w:rPr>
-          <w:b/>
-        </w:rPr>
-        <w:t>Q1</w:t>
-      </w:r>
-      <w:r>
-        <w:t xml:space="preserve"> — </w:t>
-      </w:r>
-      <w:r>
-        <w:rPr>
-          <w:i/>
-          <w:iCs/>
-        </w:rPr>
-        <w:t>[</w:t>
-      </w:r>
-      <w:proofErr w:type="gramEnd"/>
-      <w:r>
-        <w:rPr>
-          <w:i/>
-        </w:rPr>
-        <w:t>author</w:t>
-      </w:r>
-      <w:r>
-        <w:rPr>
-          <w:i/>
-          <w:iCs/>
-        </w:rPr>
-        <w:t>]</w:t>
-      </w:r>
-    </w:p>
-    <w:p>
-      <w:r>
-        <w:t xml:space="preserve">  </w:t>
-      </w:r>
-      <w:r>
-        <w:rPr>
-          <w:i/>
-          <w:iCs/>
-        </w:rPr>
-        <w:t xml:space="preserve">[insert </w:t>
-      </w:r>
-      <w:r>
-        <w:rPr>
-          <w:i/>
-        </w:rPr>
-        <w:t>screenshot</w:t>
-      </w:r>
-      <w:r>
-        <w:rPr>
-          <w:i/>
-          <w:iCs/>
-        </w:rPr>
-        <w:t>]</w:t>
-      </w:r>
-    </w:p>
-    <w:p>
-      <w:r>
-        <w:t xml:space="preserve">Explanation: </w:t>
-      </w:r>
-      <w:r>
-        <w:rPr>
-          <w:i/>
-          <w:iCs/>
-        </w:rPr>
-        <w:t>[</w:t>
-      </w:r>
-      <w:r>
-        <w:rPr>
-          <w:i/>
-          <w:iCs/>
-        </w:rPr>
-        <w:t>summarize</w:t>
-      </w:r>
-      <w:r>
-        <w:rPr>
-          <w:i/>
-          <w:iCs/>
-        </w:rPr>
-        <w:t xml:space="preserve"> the query logic and </w:t>
-      </w:r>
-      <w:r>
-        <w:rPr>
-          <w:i/>
-          <w:iCs/>
-        </w:rPr>
-        <w:t xml:space="preserve">key </w:t>
-      </w:r>
-      <w:r>
-        <w:rPr>
-          <w:i/>
-          <w:iCs/>
-        </w:rPr>
-        <w:t>result]</w:t>
-      </w:r>
-    </w:p>
-    <w:p>
-      <w:r>
-        <w:t xml:space="preserve">- </w:t>
-      </w:r>
-      <w:proofErr w:type="gramStart"/>
-      <w:r>
-        <w:rPr>
-          <w:b/>
-          <w:bCs/>
-        </w:rPr>
-        <w:t>Q2</w:t>
-      </w:r>
-      <w:r>
-        <w:t xml:space="preserve"> — </w:t>
-      </w:r>
-      <w:r>
-        <w:rPr>
-          <w:i/>
-          <w:iCs/>
-        </w:rPr>
-        <w:t>[</w:t>
-      </w:r>
-      <w:proofErr w:type="gramEnd"/>
-      <w:r>
-        <w:rPr>
-          <w:i/>
-          <w:iCs/>
-        </w:rPr>
-        <w:t>author]</w:t>
-      </w:r>
-    </w:p>
-    <w:p>
-      <w:r>
-        <w:t>Repeat this format for Q3 through Q20.</w:t>
-      </w:r>
-    </w:p>
-    <w:p>
-      <w:pPr>
-        <w:pStyle w:val="Heading1"/>
-        <w:rPr>
-          <w:rFonts w:cstheme="minorBidi"/>
-        </w:rPr>
-      </w:pPr>
-      <w:bookmarkStart w:id="11" w:name="_Toc242304782"/>
-      <w:r>
-        <w:rPr>
-          <w:rFonts w:cstheme="minorBidi"/>
-        </w:rPr>
-        <w:t>Appendix B — Handout Checklist</w:t>
-      </w:r>
-      <w:bookmarkEnd w:id="11"/>
-    </w:p>
-    <w:p/>
-    <w:p>
-      <w:r>
-        <w:t>- [x] Include one SQL query for every question.</w:t>
-      </w:r>
-    </w:p>
-    <w:p>
-      <w:r>
-        <w:t xml:space="preserve">- [x] </w:t>
-      </w:r>
-      <w:proofErr w:type="gramStart"/>
-      <w:r>
-        <w:t>Comment</w:t>
-      </w:r>
-      <w:proofErr w:type="gramEnd"/>
-      <w:r>
-        <w:t xml:space="preserve"> the main logic of each query.</w:t>
-      </w:r>
-    </w:p>
-    <w:p>
-      <w:r>
-        <w:t>- [x] Use valid, consistently indented, readable SQL.</w:t>
-      </w:r>
-    </w:p>
-    <w:p>
-      <w:r>
-        <w:t xml:space="preserve">- [x] Apply </w:t>
-      </w:r>
-      <w:proofErr w:type="gramStart"/>
-      <w:r>
-        <w:t>joins</w:t>
-      </w:r>
-      <w:proofErr w:type="gramEnd"/>
-      <w:r>
-        <w:t>, grouping, subqueries, aggregates, date/time functions, and CTEs where appropriate.</w:t>
-      </w:r>
-    </w:p>
-    <w:p>
-      <w:r>
-        <w:t xml:space="preserve">- [x] Use </w:t>
-      </w:r>
-      <w:r>
-        <w:rPr>
-          <w:i/>
-        </w:rPr>
-        <w:t>LEFT JOIN</w:t>
-      </w:r>
-      <w:r>
-        <w:t xml:space="preserve"> or </w:t>
-      </w:r>
-      <w:r>
-        <w:rPr>
-          <w:i/>
-        </w:rPr>
-        <w:t>NOT EXISTS</w:t>
-      </w:r>
-      <w:r>
-        <w:t xml:space="preserve"> to identify patients with no related records.</w:t>
-      </w:r>
-    </w:p>
-    <w:p>
-      <w:r>
-        <w:t>- [x] Calculate length of stay from entry and exit timestamps.</w:t>
-      </w:r>
-    </w:p>
-    <w:p>
-      <w:r>
-        <w:t>- [x] Include only completed admissions with discharge timestamps in the relevant counts.</w:t>
-      </w:r>
-    </w:p>
-    <w:p>
-      <w:r>
-        <w:t>- [x] Confirm that each completed admission has at least one primary ICD-9 diagnosis.</w:t>
-      </w:r>
-    </w:p>
-    <w:p>
-      <w:r>
-        <w:t>- [x] Complete all 20 queries, assigning approximately four or five to each member.</w:t>
-      </w:r>
-    </w:p>
-    <w:p>
-      <w:r>
-        <w:t>- [x] Clearly document each member’s contribution.</w:t>
-      </w:r>
-    </w:p>
-    <w:p>
-      <w:r>
-        <w:t xml:space="preserve">- [x] Submit the PDF in a ZIP file named </w:t>
-      </w:r>
-      <w:r>
-        <w:rPr>
-          <w:i/>
-        </w:rPr>
-        <w:t>SOEN363_Project_Phase1_&lt;</w:t>
-      </w:r>
-      <w:proofErr w:type="spellStart"/>
-      <w:r>
-        <w:rPr>
-          <w:i/>
-        </w:rPr>
-        <w:t>TeamName</w:t>
-      </w:r>
-      <w:proofErr w:type="spellEnd"/>
+        <w:t>DataBase_Gurus</w:t>
+      </w:r>
       <w:r>
         <w:rPr>
           <w:i/>
@@ -3314,7 +3626,6 @@
           <w:docPartUnique/>
         </w:docPartObj>
       </w:sdtPr>
-      <w:sdtEndPr/>
       <w:sdtContent>
         <w:p>
           <w:pPr>
@@ -3330,7 +3641,6 @@
             <w:id w:val="111145805"/>
             <w:bibliography/>
           </w:sdtPr>
-          <w:sdtEndPr/>
           <w:sdtContent>
             <w:p>
               <w:r>
@@ -3380,7 +3690,7 @@
       </w:r>
     </w:p>
     <w:sectPr>
-      <w:footerReference w:type="default" r:id="rId12"/>
+      <w:footerReference w:type="default" r:id="rId17"/>
       <w:pgSz w:w="12240" w:h="15840"/>
       <w:pgMar w:top="1440" w:right="1440" w:bottom="1440" w:left="1440" w:header="720" w:footer="720" w:gutter="0"/>
       <w:pgNumType w:start="0"/>
@@ -6530,6 +6840,32 @@
       <w:spacing w:after="0"/>
     </w:pPr>
   </w:style>
+  <w:style w:type="character" w:styleId="HTMLCode">
+    <w:name w:val="HTML Code"/>
+    <w:basedOn w:val="DefaultParagraphFont"/>
+    <w:uiPriority w:val="99"/>
+    <w:semiHidden/>
+    <w:unhideWhenUsed/>
+    <w:rsid w:val="000E4A55"/>
+    <w:rPr>
+      <w:rFonts w:ascii="Courier New" w:eastAsia="Times New Roman" w:hAnsi="Courier New" w:cs="Courier New"/>
+      <w:sz w:val="20"/>
+      <w:szCs w:val="20"/>
+    </w:rPr>
+  </w:style>
+  <w:style w:type="paragraph" w:customStyle="1" w:styleId="ds-markdown-paragraph">
+    <w:name w:val="ds-markdown-paragraph"/>
+    <w:basedOn w:val="Normal"/>
+    <w:rsid w:val="002C38D4"/>
+    <w:pPr>
+      <w:spacing w:before="100" w:beforeAutospacing="1" w:after="100" w:afterAutospacing="1" w:line="240" w:lineRule="auto"/>
+    </w:pPr>
+    <w:rPr>
+      <w:rFonts w:ascii="Times New Roman" w:eastAsia="Times New Roman" w:hAnsi="Times New Roman" w:cs="Times New Roman"/>
+      <w:kern w:val="0"/>
+      <w14:ligatures w14:val="none"/>
+    </w:rPr>
+  </w:style>
 </w:styles>
 </file>
 
@@ -6646,6 +6982,13 @@
     <w:pitch w:val="variable"/>
     <w:sig w:usb0="20000287" w:usb1="00000003" w:usb2="00000000" w:usb3="00000000" w:csb0="0000019F" w:csb1="00000000"/>
   </w:font>
+  <w:font w:name="Segoe UI">
+    <w:panose1 w:val="020B0502040204020203"/>
+    <w:charset w:val="00"/>
+    <w:family w:val="swiss"/>
+    <w:pitch w:val="variable"/>
+    <w:sig w:usb0="E4002EFF" w:usb1="C000E47F" w:usb2="00000009" w:usb3="00000000" w:csb0="000001FF" w:csb1="00000000"/>
+  </w:font>
 </w:fonts>
 </file>
 
@@ -6667,10 +7010,14 @@
     <w:rsidRoot w:val="00DD1CA2"/>
     <w:rsid w:val="00017C17"/>
     <w:rsid w:val="002550DE"/>
+    <w:rsid w:val="005F7401"/>
+    <w:rsid w:val="00657D28"/>
+    <w:rsid w:val="0068640A"/>
+    <w:rsid w:val="006C46B9"/>
     <w:rsid w:val="009C02DB"/>
-    <w:rsid w:val="00AB055C"/>
     <w:rsid w:val="00CF76F8"/>
     <w:rsid w:val="00DD1CA2"/>
+    <w:rsid w:val="00F60627"/>
   </w:rsids>
   <m:mathPr>
     <m:mathFont m:val="Cambria Math"/>

</xml_diff>